<commit_message>
docs: finalize report and readme with exact github commit hashes
</commit_message>
<xml_diff>
--- a/Bao_Cao/Bao_Cao_Tien_Do_Do_An_BigData.docx
+++ b/Bao_Cao/Bao_Cao_Tien_Do_Do_An_BigData.docx
@@ -147,7 +147,7 @@
           <w:noProof/>
         </w:rPr>
         <w:drawing>
-          <wp:inline distT="0" distB="0" distL="0" distR="0" wp14:anchorId="028369EF" wp14:editId="06839ED0">
+          <wp:inline distT="0" distB="0" distL="0" distR="0" wp14:anchorId="3BBDC047" wp14:editId="79864040">
             <wp:extent cx="1691640" cy="986790"/>
             <wp:effectExtent l="0" t="0" r="0" b="0"/>
             <wp:docPr id="1" name="Picture 1"/>
@@ -1136,7 +1136,7 @@
           <w:noProof/>
         </w:rPr>
         <w:drawing>
-          <wp:inline distT="0" distB="0" distL="0" distR="0" wp14:anchorId="027052C2" wp14:editId="2A2381A2">
+          <wp:inline distT="0" distB="0" distL="0" distR="0" wp14:anchorId="2E5BDD00" wp14:editId="153A0552">
             <wp:extent cx="1691640" cy="986790"/>
             <wp:effectExtent l="0" t="0" r="0" b="0"/>
             <wp:docPr id="2" name="Picture 2"/>
@@ -2124,7 +2124,7 @@
         <w:pStyle w:val="Heading1"/>
         <w:jc w:val="center"/>
       </w:pPr>
-      <w:bookmarkStart w:id="0" w:name="_Toc244085922"/>
+      <w:bookmarkStart w:id="0" w:name="_Toc244086059"/>
       <w:r>
         <w:rPr>
           <w:rFonts w:ascii="Times New Roman" w:hAnsi="Times New Roman"/>
@@ -2701,7 +2701,7 @@
         <w:pStyle w:val="Heading1"/>
         <w:jc w:val="center"/>
       </w:pPr>
-      <w:bookmarkStart w:id="1" w:name="_Toc244085923"/>
+      <w:bookmarkStart w:id="1" w:name="_Toc244086060"/>
       <w:r>
         <w:rPr>
           <w:rFonts w:ascii="Times New Roman" w:hAnsi="Times New Roman"/>
@@ -3492,7 +3492,7 @@
         <w:pStyle w:val="Heading1"/>
         <w:jc w:val="center"/>
       </w:pPr>
-      <w:bookmarkStart w:id="2" w:name="_Toc244085924"/>
+      <w:bookmarkStart w:id="2" w:name="_Toc244086061"/>
       <w:r>
         <w:rPr>
           <w:rFonts w:ascii="Times New Roman" w:hAnsi="Times New Roman"/>
@@ -4459,7 +4459,7 @@
       <w:r>
         <w:fldChar w:fldCharType="separate"/>
       </w:r>
-      <w:hyperlink w:anchor="_Toc244085922" w:history="1">
+      <w:hyperlink w:anchor="_Toc244086059" w:history="1">
         <w:r>
           <w:rPr>
             <w:rStyle w:val="Hyperlink"/>
@@ -4486,7 +4486,7 @@
             <w:noProof/>
             <w:webHidden/>
           </w:rPr>
-          <w:instrText xml:space="preserve"> PAGEREF _Toc244085922 \h </w:instrText>
+          <w:instrText xml:space="preserve"> PAGEREF _Toc244086059 \h </w:instrText>
         </w:r>
         <w:r>
           <w:rPr>
@@ -4527,7 +4527,7 @@
           <w:noProof/>
         </w:rPr>
       </w:pPr>
-      <w:hyperlink w:anchor="_Toc244085923" w:history="1">
+      <w:hyperlink w:anchor="_Toc244086060" w:history="1">
         <w:r>
           <w:rPr>
             <w:rStyle w:val="Hyperlink"/>
@@ -4554,7 +4554,7 @@
             <w:noProof/>
             <w:webHidden/>
           </w:rPr>
-          <w:instrText xml:space="preserve"> PAGEREF _Toc244085923 \h </w:instrText>
+          <w:instrText xml:space="preserve"> PAGEREF _Toc244086060 \h </w:instrText>
         </w:r>
         <w:r>
           <w:rPr>
@@ -4595,7 +4595,7 @@
           <w:noProof/>
         </w:rPr>
       </w:pPr>
-      <w:hyperlink w:anchor="_Toc244085924" w:history="1">
+      <w:hyperlink w:anchor="_Toc244086061" w:history="1">
         <w:r>
           <w:rPr>
             <w:rStyle w:val="Hyperlink"/>
@@ -4622,7 +4622,7 @@
             <w:noProof/>
             <w:webHidden/>
           </w:rPr>
-          <w:instrText xml:space="preserve"> PAGEREF _Toc244085924 \h </w:instrText>
+          <w:instrText xml:space="preserve"> PAGEREF _Toc244086061 \h </w:instrText>
         </w:r>
         <w:r>
           <w:rPr>
@@ -4663,7 +4663,7 @@
           <w:noProof/>
         </w:rPr>
       </w:pPr>
-      <w:hyperlink w:anchor="_Toc244085925" w:history="1">
+      <w:hyperlink w:anchor="_Toc244086062" w:history="1">
         <w:r>
           <w:rPr>
             <w:rStyle w:val="Hyperlink"/>
@@ -4690,7 +4690,7 @@
             <w:noProof/>
             <w:webHidden/>
           </w:rPr>
-          <w:instrText xml:space="preserve"> PAGEREF _Toc244085925 \h </w:instrText>
+          <w:instrText xml:space="preserve"> PAGEREF _Toc244086062 \h </w:instrText>
         </w:r>
         <w:r>
           <w:rPr>
@@ -4731,7 +4731,7 @@
           <w:noProof/>
         </w:rPr>
       </w:pPr>
-      <w:hyperlink w:anchor="_Toc244085926" w:history="1">
+      <w:hyperlink w:anchor="_Toc244086063" w:history="1">
         <w:r>
           <w:rPr>
             <w:rStyle w:val="Hyperlink"/>
@@ -4758,7 +4758,7 @@
             <w:noProof/>
             <w:webHidden/>
           </w:rPr>
-          <w:instrText xml:space="preserve"> PAGEREF _Toc244085926 \h </w:instrText>
+          <w:instrText xml:space="preserve"> PAGEREF _Toc244086063 \h </w:instrText>
         </w:r>
         <w:r>
           <w:rPr>
@@ -4799,7 +4799,7 @@
           <w:noProof/>
         </w:rPr>
       </w:pPr>
-      <w:hyperlink w:anchor="_Toc244085927" w:history="1">
+      <w:hyperlink w:anchor="_Toc244086064" w:history="1">
         <w:r>
           <w:rPr>
             <w:rStyle w:val="Hyperlink"/>
@@ -4826,7 +4826,7 @@
             <w:noProof/>
             <w:webHidden/>
           </w:rPr>
-          <w:instrText xml:space="preserve"> PAGEREF _Toc244085927 \h </w:instrText>
+          <w:instrText xml:space="preserve"> PAGEREF _Toc244086064 \h </w:instrText>
         </w:r>
         <w:r>
           <w:rPr>
@@ -4867,7 +4867,7 @@
           <w:noProof/>
         </w:rPr>
       </w:pPr>
-      <w:hyperlink w:anchor="_Toc244085928" w:history="1">
+      <w:hyperlink w:anchor="_Toc244086065" w:history="1">
         <w:r>
           <w:rPr>
             <w:rStyle w:val="Hyperlink"/>
@@ -4894,7 +4894,7 @@
             <w:noProof/>
             <w:webHidden/>
           </w:rPr>
-          <w:instrText xml:space="preserve"> PAGEREF _Toc244085928 \h </w:instrText>
+          <w:instrText xml:space="preserve"> PAGEREF _Toc244086065 \h </w:instrText>
         </w:r>
         <w:r>
           <w:rPr>
@@ -4935,7 +4935,7 @@
           <w:noProof/>
         </w:rPr>
       </w:pPr>
-      <w:hyperlink w:anchor="_Toc244085929" w:history="1">
+      <w:hyperlink w:anchor="_Toc244086066" w:history="1">
         <w:r>
           <w:rPr>
             <w:rStyle w:val="Hyperlink"/>
@@ -4962,7 +4962,7 @@
             <w:noProof/>
             <w:webHidden/>
           </w:rPr>
-          <w:instrText xml:space="preserve"> PAGEREF _Toc244085929 \h </w:instrText>
+          <w:instrText xml:space="preserve"> PAGEREF _Toc244086066 \h </w:instrText>
         </w:r>
         <w:r>
           <w:rPr>
@@ -5003,7 +5003,7 @@
           <w:noProof/>
         </w:rPr>
       </w:pPr>
-      <w:hyperlink w:anchor="_Toc244085930" w:history="1">
+      <w:hyperlink w:anchor="_Toc244086067" w:history="1">
         <w:r>
           <w:rPr>
             <w:rStyle w:val="Hyperlink"/>
@@ -5030,7 +5030,7 @@
             <w:noProof/>
             <w:webHidden/>
           </w:rPr>
-          <w:instrText xml:space="preserve"> PAGEREF _Toc244085930 \h </w:instrText>
+          <w:instrText xml:space="preserve"> PAGEREF _Toc244086067 \h </w:instrText>
         </w:r>
         <w:r>
           <w:rPr>
@@ -5071,7 +5071,7 @@
           <w:noProof/>
         </w:rPr>
       </w:pPr>
-      <w:hyperlink w:anchor="_Toc244085931" w:history="1">
+      <w:hyperlink w:anchor="_Toc244086068" w:history="1">
         <w:r>
           <w:rPr>
             <w:rStyle w:val="Hyperlink"/>
@@ -5098,7 +5098,7 @@
             <w:noProof/>
             <w:webHidden/>
           </w:rPr>
-          <w:instrText xml:space="preserve"> PAGEREF _Toc244085931 \h </w:instrText>
+          <w:instrText xml:space="preserve"> PAGEREF _Toc244086068 \h </w:instrText>
         </w:r>
         <w:r>
           <w:rPr>
@@ -5139,7 +5139,7 @@
           <w:noProof/>
         </w:rPr>
       </w:pPr>
-      <w:hyperlink w:anchor="_Toc244085932" w:history="1">
+      <w:hyperlink w:anchor="_Toc244086069" w:history="1">
         <w:r>
           <w:rPr>
             <w:rStyle w:val="Hyperlink"/>
@@ -5166,7 +5166,7 @@
             <w:noProof/>
             <w:webHidden/>
           </w:rPr>
-          <w:instrText xml:space="preserve"> PAGEREF _Toc244085932 \h </w:instrText>
+          <w:instrText xml:space="preserve"> PAGEREF _Toc244086069 \h </w:instrText>
         </w:r>
         <w:r>
           <w:rPr>
@@ -5207,7 +5207,7 @@
           <w:noProof/>
         </w:rPr>
       </w:pPr>
-      <w:hyperlink w:anchor="_Toc244085933" w:history="1">
+      <w:hyperlink w:anchor="_Toc244086070" w:history="1">
         <w:r>
           <w:rPr>
             <w:rStyle w:val="Hyperlink"/>
@@ -5234,7 +5234,7 @@
             <w:noProof/>
             <w:webHidden/>
           </w:rPr>
-          <w:instrText xml:space="preserve"> PAGEREF _Toc244085933 \h </w:instrText>
+          <w:instrText xml:space="preserve"> PAGEREF _Toc244086070 \h </w:instrText>
         </w:r>
         <w:r>
           <w:rPr>
@@ -5275,7 +5275,7 @@
           <w:noProof/>
         </w:rPr>
       </w:pPr>
-      <w:hyperlink w:anchor="_Toc244085934" w:history="1">
+      <w:hyperlink w:anchor="_Toc244086071" w:history="1">
         <w:r>
           <w:rPr>
             <w:rStyle w:val="Hyperlink"/>
@@ -5302,7 +5302,7 @@
             <w:noProof/>
             <w:webHidden/>
           </w:rPr>
-          <w:instrText xml:space="preserve"> PAGEREF _Toc244085934 \h </w:instrText>
+          <w:instrText xml:space="preserve"> PAGEREF _Toc244086071 \h </w:instrText>
         </w:r>
         <w:r>
           <w:rPr>
@@ -5343,7 +5343,7 @@
           <w:noProof/>
         </w:rPr>
       </w:pPr>
-      <w:hyperlink w:anchor="_Toc244085935" w:history="1">
+      <w:hyperlink w:anchor="_Toc244086072" w:history="1">
         <w:r>
           <w:rPr>
             <w:rStyle w:val="Hyperlink"/>
@@ -5370,7 +5370,7 @@
             <w:noProof/>
             <w:webHidden/>
           </w:rPr>
-          <w:instrText xml:space="preserve"> PAGEREF _Toc244085935 \h </w:instrText>
+          <w:instrText xml:space="preserve"> PAGEREF _Toc244086072 \h </w:instrText>
         </w:r>
         <w:r>
           <w:rPr>
@@ -5411,7 +5411,7 @@
           <w:noProof/>
         </w:rPr>
       </w:pPr>
-      <w:hyperlink w:anchor="_Toc244085936" w:history="1">
+      <w:hyperlink w:anchor="_Toc244086073" w:history="1">
         <w:r>
           <w:rPr>
             <w:rStyle w:val="Hyperlink"/>
@@ -5438,7 +5438,7 @@
             <w:noProof/>
             <w:webHidden/>
           </w:rPr>
-          <w:instrText xml:space="preserve"> PAGEREF _Toc244085936 \h </w:instrText>
+          <w:instrText xml:space="preserve"> PAGEREF _Toc244086073 \h </w:instrText>
         </w:r>
         <w:r>
           <w:rPr>
@@ -5479,7 +5479,7 @@
           <w:noProof/>
         </w:rPr>
       </w:pPr>
-      <w:hyperlink w:anchor="_Toc244085937" w:history="1">
+      <w:hyperlink w:anchor="_Toc244086074" w:history="1">
         <w:r>
           <w:rPr>
             <w:rStyle w:val="Hyperlink"/>
@@ -5506,7 +5506,7 @@
             <w:noProof/>
             <w:webHidden/>
           </w:rPr>
-          <w:instrText xml:space="preserve"> PAGEREF _Toc244085937 \h </w:instrText>
+          <w:instrText xml:space="preserve"> PAGEREF _Toc244086074 \h </w:instrText>
         </w:r>
         <w:r>
           <w:rPr>
@@ -5547,7 +5547,7 @@
           <w:noProof/>
         </w:rPr>
       </w:pPr>
-      <w:hyperlink w:anchor="_Toc244085938" w:history="1">
+      <w:hyperlink w:anchor="_Toc244086075" w:history="1">
         <w:r>
           <w:rPr>
             <w:rStyle w:val="Hyperlink"/>
@@ -5574,7 +5574,7 @@
             <w:noProof/>
             <w:webHidden/>
           </w:rPr>
-          <w:instrText xml:space="preserve"> PAGEREF _Toc244085938 \h </w:instrText>
+          <w:instrText xml:space="preserve"> PAGEREF _Toc244086075 \h </w:instrText>
         </w:r>
         <w:r>
           <w:rPr>
@@ -5615,7 +5615,7 @@
           <w:noProof/>
         </w:rPr>
       </w:pPr>
-      <w:hyperlink w:anchor="_Toc244085939" w:history="1">
+      <w:hyperlink w:anchor="_Toc244086076" w:history="1">
         <w:r>
           <w:rPr>
             <w:rStyle w:val="Hyperlink"/>
@@ -5642,7 +5642,7 @@
             <w:noProof/>
             <w:webHidden/>
           </w:rPr>
-          <w:instrText xml:space="preserve"> PAGEREF _Toc244085939 \h </w:instrText>
+          <w:instrText xml:space="preserve"> PAGEREF _Toc244086076 \h </w:instrText>
         </w:r>
         <w:r>
           <w:rPr>
@@ -5683,7 +5683,7 @@
           <w:noProof/>
         </w:rPr>
       </w:pPr>
-      <w:hyperlink w:anchor="_Toc244085940" w:history="1">
+      <w:hyperlink w:anchor="_Toc244086077" w:history="1">
         <w:r>
           <w:rPr>
             <w:rStyle w:val="Hyperlink"/>
@@ -5710,7 +5710,7 @@
             <w:noProof/>
             <w:webHidden/>
           </w:rPr>
-          <w:instrText xml:space="preserve"> PAGEREF _Toc244085940 \h </w:instrText>
+          <w:instrText xml:space="preserve"> PAGEREF _Toc244086077 \h </w:instrText>
         </w:r>
         <w:r>
           <w:rPr>
@@ -5751,7 +5751,7 @@
           <w:noProof/>
         </w:rPr>
       </w:pPr>
-      <w:hyperlink w:anchor="_Toc244085941" w:history="1">
+      <w:hyperlink w:anchor="_Toc244086078" w:history="1">
         <w:r>
           <w:rPr>
             <w:rStyle w:val="Hyperlink"/>
@@ -5778,7 +5778,7 @@
             <w:noProof/>
             <w:webHidden/>
           </w:rPr>
-          <w:instrText xml:space="preserve"> PAGEREF _Toc244085941 \h </w:instrText>
+          <w:instrText xml:space="preserve"> PAGEREF _Toc244086078 \h </w:instrText>
         </w:r>
         <w:r>
           <w:rPr>
@@ -5819,7 +5819,7 @@
           <w:noProof/>
         </w:rPr>
       </w:pPr>
-      <w:hyperlink w:anchor="_Toc244085942" w:history="1">
+      <w:hyperlink w:anchor="_Toc244086079" w:history="1">
         <w:r>
           <w:rPr>
             <w:rStyle w:val="Hyperlink"/>
@@ -5846,7 +5846,7 @@
             <w:noProof/>
             <w:webHidden/>
           </w:rPr>
-          <w:instrText xml:space="preserve"> PAGEREF _Toc244085942 \h </w:instrText>
+          <w:instrText xml:space="preserve"> PAGEREF _Toc244086079 \h </w:instrText>
         </w:r>
         <w:r>
           <w:rPr>
@@ -5887,7 +5887,7 @@
           <w:noProof/>
         </w:rPr>
       </w:pPr>
-      <w:hyperlink w:anchor="_Toc244085943" w:history="1">
+      <w:hyperlink w:anchor="_Toc244086080" w:history="1">
         <w:r>
           <w:rPr>
             <w:rStyle w:val="Hyperlink"/>
@@ -5914,7 +5914,7 @@
             <w:noProof/>
             <w:webHidden/>
           </w:rPr>
-          <w:instrText xml:space="preserve"> PAGEREF _Toc244085943 \h </w:instrText>
+          <w:instrText xml:space="preserve"> PAGEREF _Toc244086080 \h </w:instrText>
         </w:r>
         <w:r>
           <w:rPr>
@@ -5955,7 +5955,7 @@
           <w:noProof/>
         </w:rPr>
       </w:pPr>
-      <w:hyperlink w:anchor="_Toc244085944" w:history="1">
+      <w:hyperlink w:anchor="_Toc244086081" w:history="1">
         <w:r>
           <w:rPr>
             <w:rStyle w:val="Hyperlink"/>
@@ -5982,7 +5982,7 @@
             <w:noProof/>
             <w:webHidden/>
           </w:rPr>
-          <w:instrText xml:space="preserve"> PAGEREF _Toc244085944 \h </w:instrText>
+          <w:instrText xml:space="preserve"> PAGEREF _Toc244086081 \h </w:instrText>
         </w:r>
         <w:r>
           <w:rPr>
@@ -6023,7 +6023,7 @@
           <w:noProof/>
         </w:rPr>
       </w:pPr>
-      <w:hyperlink w:anchor="_Toc244085945" w:history="1">
+      <w:hyperlink w:anchor="_Toc244086082" w:history="1">
         <w:r>
           <w:rPr>
             <w:rStyle w:val="Hyperlink"/>
@@ -6050,7 +6050,7 @@
             <w:noProof/>
             <w:webHidden/>
           </w:rPr>
-          <w:instrText xml:space="preserve"> PAGEREF _Toc244085945 \h </w:instrText>
+          <w:instrText xml:space="preserve"> PAGEREF _Toc244086082 \h </w:instrText>
         </w:r>
         <w:r>
           <w:rPr>
@@ -6091,7 +6091,7 @@
           <w:noProof/>
         </w:rPr>
       </w:pPr>
-      <w:hyperlink w:anchor="_Toc244085946" w:history="1">
+      <w:hyperlink w:anchor="_Toc244086083" w:history="1">
         <w:r>
           <w:rPr>
             <w:rStyle w:val="Hyperlink"/>
@@ -6118,7 +6118,7 @@
             <w:noProof/>
             <w:webHidden/>
           </w:rPr>
-          <w:instrText xml:space="preserve"> PAGEREF _Toc244085946 \h </w:instrText>
+          <w:instrText xml:space="preserve"> PAGEREF _Toc244086083 \h </w:instrText>
         </w:r>
         <w:r>
           <w:rPr>
@@ -6159,7 +6159,7 @@
           <w:noProof/>
         </w:rPr>
       </w:pPr>
-      <w:hyperlink w:anchor="_Toc244085947" w:history="1">
+      <w:hyperlink w:anchor="_Toc244086084" w:history="1">
         <w:r>
           <w:rPr>
             <w:rStyle w:val="Hyperlink"/>
@@ -6186,7 +6186,7 @@
             <w:noProof/>
             <w:webHidden/>
           </w:rPr>
-          <w:instrText xml:space="preserve"> PAGEREF _Toc244085947 \h </w:instrText>
+          <w:instrText xml:space="preserve"> PAGEREF _Toc244086084 \h </w:instrText>
         </w:r>
         <w:r>
           <w:rPr>
@@ -6227,7 +6227,7 @@
           <w:noProof/>
         </w:rPr>
       </w:pPr>
-      <w:hyperlink w:anchor="_Toc244085948" w:history="1">
+      <w:hyperlink w:anchor="_Toc244086085" w:history="1">
         <w:r>
           <w:rPr>
             <w:rStyle w:val="Hyperlink"/>
@@ -6254,7 +6254,7 @@
             <w:noProof/>
             <w:webHidden/>
           </w:rPr>
-          <w:instrText xml:space="preserve"> PAGEREF _Toc244085948 \h </w:instrText>
+          <w:instrText xml:space="preserve"> PAGEREF _Toc244086085 \h </w:instrText>
         </w:r>
         <w:r>
           <w:rPr>
@@ -6295,7 +6295,7 @@
           <w:noProof/>
         </w:rPr>
       </w:pPr>
-      <w:hyperlink w:anchor="_Toc244085949" w:history="1">
+      <w:hyperlink w:anchor="_Toc244086086" w:history="1">
         <w:r>
           <w:rPr>
             <w:rStyle w:val="Hyperlink"/>
@@ -6322,7 +6322,7 @@
             <w:noProof/>
             <w:webHidden/>
           </w:rPr>
-          <w:instrText xml:space="preserve"> PAGEREF _Toc244085949 \h </w:instrText>
+          <w:instrText xml:space="preserve"> PAGEREF _Toc244086086 \h </w:instrText>
         </w:r>
         <w:r>
           <w:rPr>
@@ -6363,7 +6363,7 @@
           <w:noProof/>
         </w:rPr>
       </w:pPr>
-      <w:hyperlink w:anchor="_Toc244085950" w:history="1">
+      <w:hyperlink w:anchor="_Toc244086087" w:history="1">
         <w:r>
           <w:rPr>
             <w:rStyle w:val="Hyperlink"/>
@@ -6390,7 +6390,7 @@
             <w:noProof/>
             <w:webHidden/>
           </w:rPr>
-          <w:instrText xml:space="preserve"> PAGEREF _Toc244085950 \h </w:instrText>
+          <w:instrText xml:space="preserve"> PAGEREF _Toc244086087 \h </w:instrText>
         </w:r>
         <w:r>
           <w:rPr>
@@ -6431,7 +6431,7 @@
           <w:noProof/>
         </w:rPr>
       </w:pPr>
-      <w:hyperlink w:anchor="_Toc244085951" w:history="1">
+      <w:hyperlink w:anchor="_Toc244086088" w:history="1">
         <w:r>
           <w:rPr>
             <w:rStyle w:val="Hyperlink"/>
@@ -6458,7 +6458,7 @@
             <w:noProof/>
             <w:webHidden/>
           </w:rPr>
-          <w:instrText xml:space="preserve"> PAGEREF _Toc244085951 \h </w:instrText>
+          <w:instrText xml:space="preserve"> PAGEREF _Toc244086088 \h </w:instrText>
         </w:r>
         <w:r>
           <w:rPr>
@@ -6499,7 +6499,7 @@
           <w:noProof/>
         </w:rPr>
       </w:pPr>
-      <w:hyperlink w:anchor="_Toc244085952" w:history="1">
+      <w:hyperlink w:anchor="_Toc244086089" w:history="1">
         <w:r>
           <w:rPr>
             <w:rStyle w:val="Hyperlink"/>
@@ -6526,7 +6526,7 @@
             <w:noProof/>
             <w:webHidden/>
           </w:rPr>
-          <w:instrText xml:space="preserve"> PAGEREF _Toc244085952 \h </w:instrText>
+          <w:instrText xml:space="preserve"> PAGEREF _Toc244086089 \h </w:instrText>
         </w:r>
         <w:r>
           <w:rPr>
@@ -6567,7 +6567,7 @@
           <w:noProof/>
         </w:rPr>
       </w:pPr>
-      <w:hyperlink w:anchor="_Toc244085953" w:history="1">
+      <w:hyperlink w:anchor="_Toc244086090" w:history="1">
         <w:r>
           <w:rPr>
             <w:rStyle w:val="Hyperlink"/>
@@ -6594,7 +6594,7 @@
             <w:noProof/>
             <w:webHidden/>
           </w:rPr>
-          <w:instrText xml:space="preserve"> PAGEREF _Toc244085953 \h </w:instrText>
+          <w:instrText xml:space="preserve"> PAGEREF _Toc244086090 \h </w:instrText>
         </w:r>
         <w:r>
           <w:rPr>
@@ -6635,7 +6635,7 @@
           <w:noProof/>
         </w:rPr>
       </w:pPr>
-      <w:hyperlink w:anchor="_Toc244085954" w:history="1">
+      <w:hyperlink w:anchor="_Toc244086091" w:history="1">
         <w:r>
           <w:rPr>
             <w:rStyle w:val="Hyperlink"/>
@@ -6662,7 +6662,7 @@
             <w:noProof/>
             <w:webHidden/>
           </w:rPr>
-          <w:instrText xml:space="preserve"> PAGEREF _Toc244085954 \h </w:instrText>
+          <w:instrText xml:space="preserve"> PAGEREF _Toc244086091 \h </w:instrText>
         </w:r>
         <w:r>
           <w:rPr>
@@ -6703,7 +6703,7 @@
           <w:noProof/>
         </w:rPr>
       </w:pPr>
-      <w:hyperlink w:anchor="_Toc244085955" w:history="1">
+      <w:hyperlink w:anchor="_Toc244086092" w:history="1">
         <w:r>
           <w:rPr>
             <w:rStyle w:val="Hyperlink"/>
@@ -6730,7 +6730,7 @@
             <w:noProof/>
             <w:webHidden/>
           </w:rPr>
-          <w:instrText xml:space="preserve"> PAGEREF _Toc244085955 \h </w:instrText>
+          <w:instrText xml:space="preserve"> PAGEREF _Toc244086092 \h </w:instrText>
         </w:r>
         <w:r>
           <w:rPr>
@@ -6771,7 +6771,7 @@
           <w:noProof/>
         </w:rPr>
       </w:pPr>
-      <w:hyperlink w:anchor="_Toc244085956" w:history="1">
+      <w:hyperlink w:anchor="_Toc244086093" w:history="1">
         <w:r>
           <w:rPr>
             <w:rStyle w:val="Hyperlink"/>
@@ -6798,7 +6798,7 @@
             <w:noProof/>
             <w:webHidden/>
           </w:rPr>
-          <w:instrText xml:space="preserve"> PAGEREF _Toc244085956 \h </w:instrText>
+          <w:instrText xml:space="preserve"> PAGEREF _Toc244086093 \h </w:instrText>
         </w:r>
         <w:r>
           <w:rPr>
@@ -6839,7 +6839,7 @@
           <w:noProof/>
         </w:rPr>
       </w:pPr>
-      <w:hyperlink w:anchor="_Toc244085957" w:history="1">
+      <w:hyperlink w:anchor="_Toc244086094" w:history="1">
         <w:r>
           <w:rPr>
             <w:rStyle w:val="Hyperlink"/>
@@ -6866,7 +6866,7 @@
             <w:noProof/>
             <w:webHidden/>
           </w:rPr>
-          <w:instrText xml:space="preserve"> PAGEREF _Toc244085957 \h </w:instrText>
+          <w:instrText xml:space="preserve"> PAGEREF _Toc244086094 \h </w:instrText>
         </w:r>
         <w:r>
           <w:rPr>
@@ -6907,7 +6907,7 @@
           <w:noProof/>
         </w:rPr>
       </w:pPr>
-      <w:hyperlink w:anchor="_Toc244085958" w:history="1">
+      <w:hyperlink w:anchor="_Toc244086095" w:history="1">
         <w:r>
           <w:rPr>
             <w:rStyle w:val="Hyperlink"/>
@@ -6934,7 +6934,7 @@
             <w:noProof/>
             <w:webHidden/>
           </w:rPr>
-          <w:instrText xml:space="preserve"> PAGEREF _Toc244085958 \h </w:instrText>
+          <w:instrText xml:space="preserve"> PAGEREF _Toc244086095 \h </w:instrText>
         </w:r>
         <w:r>
           <w:rPr>
@@ -6975,7 +6975,7 @@
           <w:noProof/>
         </w:rPr>
       </w:pPr>
-      <w:hyperlink w:anchor="_Toc244085959" w:history="1">
+      <w:hyperlink w:anchor="_Toc244086096" w:history="1">
         <w:r>
           <w:rPr>
             <w:rStyle w:val="Hyperlink"/>
@@ -7002,7 +7002,7 @@
             <w:noProof/>
             <w:webHidden/>
           </w:rPr>
-          <w:instrText xml:space="preserve"> PAGEREF _Toc244085959 \h </w:instrText>
+          <w:instrText xml:space="preserve"> PAGEREF _Toc244086096 \h </w:instrText>
         </w:r>
         <w:r>
           <w:rPr>
@@ -7043,7 +7043,7 @@
           <w:noProof/>
         </w:rPr>
       </w:pPr>
-      <w:hyperlink w:anchor="_Toc244085960" w:history="1">
+      <w:hyperlink w:anchor="_Toc244086097" w:history="1">
         <w:r>
           <w:rPr>
             <w:rStyle w:val="Hyperlink"/>
@@ -7070,7 +7070,7 @@
             <w:noProof/>
             <w:webHidden/>
           </w:rPr>
-          <w:instrText xml:space="preserve"> PAGEREF _Toc244085960 \h </w:instrText>
+          <w:instrText xml:space="preserve"> PAGEREF _Toc244086097 \h </w:instrText>
         </w:r>
         <w:r>
           <w:rPr>
@@ -7111,7 +7111,7 @@
           <w:noProof/>
         </w:rPr>
       </w:pPr>
-      <w:hyperlink w:anchor="_Toc244085961" w:history="1">
+      <w:hyperlink w:anchor="_Toc244086098" w:history="1">
         <w:r>
           <w:rPr>
             <w:rStyle w:val="Hyperlink"/>
@@ -7138,7 +7138,7 @@
             <w:noProof/>
             <w:webHidden/>
           </w:rPr>
-          <w:instrText xml:space="preserve"> PAGEREF _Toc244085961 \h </w:instrText>
+          <w:instrText xml:space="preserve"> PAGEREF _Toc244086098 \h </w:instrText>
         </w:r>
         <w:r>
           <w:rPr>
@@ -7179,7 +7179,7 @@
           <w:noProof/>
         </w:rPr>
       </w:pPr>
-      <w:hyperlink w:anchor="_Toc244085962" w:history="1">
+      <w:hyperlink w:anchor="_Toc244086099" w:history="1">
         <w:r>
           <w:rPr>
             <w:rStyle w:val="Hyperlink"/>
@@ -7206,7 +7206,7 @@
             <w:noProof/>
             <w:webHidden/>
           </w:rPr>
-          <w:instrText xml:space="preserve"> PAGEREF _Toc244085962 \h </w:instrText>
+          <w:instrText xml:space="preserve"> PAGEREF _Toc244086099 \h </w:instrText>
         </w:r>
         <w:r>
           <w:rPr>
@@ -7247,7 +7247,7 @@
           <w:noProof/>
         </w:rPr>
       </w:pPr>
-      <w:hyperlink w:anchor="_Toc244085963" w:history="1">
+      <w:hyperlink w:anchor="_Toc244086100" w:history="1">
         <w:r>
           <w:rPr>
             <w:rStyle w:val="Hyperlink"/>
@@ -7274,7 +7274,7 @@
             <w:noProof/>
             <w:webHidden/>
           </w:rPr>
-          <w:instrText xml:space="preserve"> PAGEREF _Toc244085963 \h </w:instrText>
+          <w:instrText xml:space="preserve"> PAGEREF _Toc244086100 \h </w:instrText>
         </w:r>
         <w:r>
           <w:rPr>
@@ -7315,7 +7315,7 @@
           <w:noProof/>
         </w:rPr>
       </w:pPr>
-      <w:hyperlink w:anchor="_Toc244085964" w:history="1">
+      <w:hyperlink w:anchor="_Toc244086101" w:history="1">
         <w:r>
           <w:rPr>
             <w:rStyle w:val="Hyperlink"/>
@@ -7342,7 +7342,7 @@
             <w:noProof/>
             <w:webHidden/>
           </w:rPr>
-          <w:instrText xml:space="preserve"> PAGEREF _Toc244085964 \h </w:instrText>
+          <w:instrText xml:space="preserve"> PAGEREF _Toc244086101 \h </w:instrText>
         </w:r>
         <w:r>
           <w:rPr>
@@ -7383,7 +7383,7 @@
           <w:noProof/>
         </w:rPr>
       </w:pPr>
-      <w:hyperlink w:anchor="_Toc244085965" w:history="1">
+      <w:hyperlink w:anchor="_Toc244086102" w:history="1">
         <w:r>
           <w:rPr>
             <w:rStyle w:val="Hyperlink"/>
@@ -7410,7 +7410,7 @@
             <w:noProof/>
             <w:webHidden/>
           </w:rPr>
-          <w:instrText xml:space="preserve"> PAGEREF _Toc244085965 \h </w:instrText>
+          <w:instrText xml:space="preserve"> PAGEREF _Toc244086102 \h </w:instrText>
         </w:r>
         <w:r>
           <w:rPr>
@@ -7451,7 +7451,7 @@
           <w:noProof/>
         </w:rPr>
       </w:pPr>
-      <w:hyperlink w:anchor="_Toc244085966" w:history="1">
+      <w:hyperlink w:anchor="_Toc244086103" w:history="1">
         <w:r>
           <w:rPr>
             <w:rStyle w:val="Hyperlink"/>
@@ -7478,7 +7478,7 @@
             <w:noProof/>
             <w:webHidden/>
           </w:rPr>
-          <w:instrText xml:space="preserve"> PAGEREF _Toc244085966 \h </w:instrText>
+          <w:instrText xml:space="preserve"> PAGEREF _Toc244086103 \h </w:instrText>
         </w:r>
         <w:r>
           <w:rPr>
@@ -7519,7 +7519,7 @@
           <w:noProof/>
         </w:rPr>
       </w:pPr>
-      <w:hyperlink w:anchor="_Toc244085967" w:history="1">
+      <w:hyperlink w:anchor="_Toc244086104" w:history="1">
         <w:r>
           <w:rPr>
             <w:rStyle w:val="Hyperlink"/>
@@ -7546,7 +7546,7 @@
             <w:noProof/>
             <w:webHidden/>
           </w:rPr>
-          <w:instrText xml:space="preserve"> PAGEREF _Toc244085967 \h </w:instrText>
+          <w:instrText xml:space="preserve"> PAGEREF _Toc244086104 \h </w:instrText>
         </w:r>
         <w:r>
           <w:rPr>
@@ -7587,7 +7587,7 @@
           <w:noProof/>
         </w:rPr>
       </w:pPr>
-      <w:hyperlink w:anchor="_Toc244085968" w:history="1">
+      <w:hyperlink w:anchor="_Toc244086105" w:history="1">
         <w:r>
           <w:rPr>
             <w:rStyle w:val="Hyperlink"/>
@@ -7614,7 +7614,7 @@
             <w:noProof/>
             <w:webHidden/>
           </w:rPr>
-          <w:instrText xml:space="preserve"> PAGEREF _Toc244085968 \h </w:instrText>
+          <w:instrText xml:space="preserve"> PAGEREF _Toc244086105 \h </w:instrText>
         </w:r>
         <w:r>
           <w:rPr>
@@ -7655,7 +7655,7 @@
           <w:noProof/>
         </w:rPr>
       </w:pPr>
-      <w:hyperlink w:anchor="_Toc244085969" w:history="1">
+      <w:hyperlink w:anchor="_Toc244086106" w:history="1">
         <w:r>
           <w:rPr>
             <w:rStyle w:val="Hyperlink"/>
@@ -7682,7 +7682,7 @@
             <w:noProof/>
             <w:webHidden/>
           </w:rPr>
-          <w:instrText xml:space="preserve"> PAGEREF _Toc244085969 \h </w:instrText>
+          <w:instrText xml:space="preserve"> PAGEREF _Toc244086106 \h </w:instrText>
         </w:r>
         <w:r>
           <w:rPr>
@@ -7723,7 +7723,7 @@
           <w:noProof/>
         </w:rPr>
       </w:pPr>
-      <w:hyperlink w:anchor="_Toc244085970" w:history="1">
+      <w:hyperlink w:anchor="_Toc244086107" w:history="1">
         <w:r>
           <w:rPr>
             <w:rStyle w:val="Hyperlink"/>
@@ -7750,7 +7750,7 @@
             <w:noProof/>
             <w:webHidden/>
           </w:rPr>
-          <w:instrText xml:space="preserve"> PAGEREF _Toc244085970 \h </w:instrText>
+          <w:instrText xml:space="preserve"> PAGEREF _Toc244086107 \h </w:instrText>
         </w:r>
         <w:r>
           <w:rPr>
@@ -7791,7 +7791,7 @@
           <w:noProof/>
         </w:rPr>
       </w:pPr>
-      <w:hyperlink w:anchor="_Toc244085971" w:history="1">
+      <w:hyperlink w:anchor="_Toc244086108" w:history="1">
         <w:r>
           <w:rPr>
             <w:rStyle w:val="Hyperlink"/>
@@ -7818,7 +7818,7 @@
             <w:noProof/>
             <w:webHidden/>
           </w:rPr>
-          <w:instrText xml:space="preserve"> PAGEREF _Toc244085971 \h </w:instrText>
+          <w:instrText xml:space="preserve"> PAGEREF _Toc244086108 \h </w:instrText>
         </w:r>
         <w:r>
           <w:rPr>
@@ -7859,7 +7859,7 @@
           <w:noProof/>
         </w:rPr>
       </w:pPr>
-      <w:hyperlink w:anchor="_Toc244085972" w:history="1">
+      <w:hyperlink w:anchor="_Toc244086109" w:history="1">
         <w:r>
           <w:rPr>
             <w:rStyle w:val="Hyperlink"/>
@@ -7886,7 +7886,7 @@
             <w:noProof/>
             <w:webHidden/>
           </w:rPr>
-          <w:instrText xml:space="preserve"> PAGEREF _Toc244085972 \h </w:instrText>
+          <w:instrText xml:space="preserve"> PAGEREF _Toc244086109 \h </w:instrText>
         </w:r>
         <w:r>
           <w:rPr>
@@ -7934,7 +7934,7 @@
       <w:pPr>
         <w:pStyle w:val="Heading1"/>
       </w:pPr>
-      <w:bookmarkStart w:id="3" w:name="_Toc244085925"/>
+      <w:bookmarkStart w:id="3" w:name="_Toc244086062"/>
       <w:r>
         <w:rPr>
           <w:rFonts w:ascii="Times New Roman" w:hAnsi="Times New Roman"/>
@@ -9306,7 +9306,7 @@
       <w:pPr>
         <w:pStyle w:val="Heading1"/>
       </w:pPr>
-      <w:bookmarkStart w:id="4" w:name="_Toc244085926"/>
+      <w:bookmarkStart w:id="4" w:name="_Toc244086063"/>
       <w:r>
         <w:rPr>
           <w:rFonts w:ascii="Times New Roman" w:hAnsi="Times New Roman"/>
@@ -9376,7 +9376,7 @@
       <w:r>
         <w:fldChar w:fldCharType="separate"/>
       </w:r>
-      <w:hyperlink w:anchor="_Toc244085973" w:history="1">
+      <w:hyperlink w:anchor="_Toc244086110" w:history="1">
         <w:r>
           <w:rPr>
             <w:rStyle w:val="Hyperlink"/>
@@ -9403,7 +9403,7 @@
             <w:noProof/>
             <w:webHidden/>
           </w:rPr>
-          <w:instrText xml:space="preserve"> PAGEREF _Toc244085973 \h </w:instrText>
+          <w:instrText xml:space="preserve"> PAGEREF _Toc244086110 \h </w:instrText>
         </w:r>
         <w:r>
           <w:rPr>
@@ -9450,7 +9450,7 @@
           <w14:ligatures w14:val="standardContextual"/>
         </w:rPr>
       </w:pPr>
-      <w:hyperlink w:anchor="_Toc244085974" w:history="1">
+      <w:hyperlink w:anchor="_Toc244086111" w:history="1">
         <w:r>
           <w:rPr>
             <w:rStyle w:val="Hyperlink"/>
@@ -9477,7 +9477,7 @@
             <w:noProof/>
             <w:webHidden/>
           </w:rPr>
-          <w:instrText xml:space="preserve"> PAGEREF _Toc244085974 \h </w:instrText>
+          <w:instrText xml:space="preserve"> PAGEREF _Toc244086111 \h </w:instrText>
         </w:r>
         <w:r>
           <w:rPr>
@@ -9524,7 +9524,7 @@
           <w14:ligatures w14:val="standardContextual"/>
         </w:rPr>
       </w:pPr>
-      <w:hyperlink w:anchor="_Toc244085975" w:history="1">
+      <w:hyperlink w:anchor="_Toc244086112" w:history="1">
         <w:r>
           <w:rPr>
             <w:rStyle w:val="Hyperlink"/>
@@ -9551,7 +9551,7 @@
             <w:noProof/>
             <w:webHidden/>
           </w:rPr>
-          <w:instrText xml:space="preserve"> PAGEREF _Toc244085975 \h </w:instrText>
+          <w:instrText xml:space="preserve"> PAGEREF _Toc244086112 \h </w:instrText>
         </w:r>
         <w:r>
           <w:rPr>
@@ -9598,7 +9598,7 @@
           <w14:ligatures w14:val="standardContextual"/>
         </w:rPr>
       </w:pPr>
-      <w:hyperlink w:anchor="_Toc244085976" w:history="1">
+      <w:hyperlink w:anchor="_Toc244086113" w:history="1">
         <w:r>
           <w:rPr>
             <w:rStyle w:val="Hyperlink"/>
@@ -9625,7 +9625,7 @@
             <w:noProof/>
             <w:webHidden/>
           </w:rPr>
-          <w:instrText xml:space="preserve"> PAGEREF _Toc244085976 \h </w:instrText>
+          <w:instrText xml:space="preserve"> PAGEREF _Toc244086113 \h </w:instrText>
         </w:r>
         <w:r>
           <w:rPr>
@@ -9672,7 +9672,7 @@
           <w14:ligatures w14:val="standardContextual"/>
         </w:rPr>
       </w:pPr>
-      <w:hyperlink w:anchor="_Toc244085977" w:history="1">
+      <w:hyperlink w:anchor="_Toc244086114" w:history="1">
         <w:r>
           <w:rPr>
             <w:rStyle w:val="Hyperlink"/>
@@ -9699,7 +9699,7 @@
             <w:noProof/>
             <w:webHidden/>
           </w:rPr>
-          <w:instrText xml:space="preserve"> PAGEREF _Toc244085977 \h </w:instrText>
+          <w:instrText xml:space="preserve"> PAGEREF _Toc244086114 \h </w:instrText>
         </w:r>
         <w:r>
           <w:rPr>
@@ -9746,7 +9746,7 @@
           <w14:ligatures w14:val="standardContextual"/>
         </w:rPr>
       </w:pPr>
-      <w:hyperlink w:anchor="_Toc244085978" w:history="1">
+      <w:hyperlink w:anchor="_Toc244086115" w:history="1">
         <w:r>
           <w:rPr>
             <w:rStyle w:val="Hyperlink"/>
@@ -9773,7 +9773,7 @@
             <w:noProof/>
             <w:webHidden/>
           </w:rPr>
-          <w:instrText xml:space="preserve"> PAGEREF _Toc244085978 \h </w:instrText>
+          <w:instrText xml:space="preserve"> PAGEREF _Toc244086115 \h </w:instrText>
         </w:r>
         <w:r>
           <w:rPr>
@@ -9820,7 +9820,7 @@
           <w14:ligatures w14:val="standardContextual"/>
         </w:rPr>
       </w:pPr>
-      <w:hyperlink w:anchor="_Toc244085979" w:history="1">
+      <w:hyperlink w:anchor="_Toc244086116" w:history="1">
         <w:r>
           <w:rPr>
             <w:rStyle w:val="Hyperlink"/>
@@ -9847,7 +9847,7 @@
             <w:noProof/>
             <w:webHidden/>
           </w:rPr>
-          <w:instrText xml:space="preserve"> PAGEREF _Toc244085979 \h </w:instrText>
+          <w:instrText xml:space="preserve"> PAGEREF _Toc244086116 \h </w:instrText>
         </w:r>
         <w:r>
           <w:rPr>
@@ -9894,7 +9894,7 @@
           <w14:ligatures w14:val="standardContextual"/>
         </w:rPr>
       </w:pPr>
-      <w:hyperlink w:anchor="_Toc244085980" w:history="1">
+      <w:hyperlink w:anchor="_Toc244086117" w:history="1">
         <w:r>
           <w:rPr>
             <w:rStyle w:val="Hyperlink"/>
@@ -9921,7 +9921,7 @@
             <w:noProof/>
             <w:webHidden/>
           </w:rPr>
-          <w:instrText xml:space="preserve"> PAGEREF _Toc244085980 \h </w:instrText>
+          <w:instrText xml:space="preserve"> PAGEREF _Toc244086117 \h </w:instrText>
         </w:r>
         <w:r>
           <w:rPr>
@@ -9968,7 +9968,7 @@
           <w14:ligatures w14:val="standardContextual"/>
         </w:rPr>
       </w:pPr>
-      <w:hyperlink w:anchor="_Toc244085981" w:history="1">
+      <w:hyperlink w:anchor="_Toc244086118" w:history="1">
         <w:r>
           <w:rPr>
             <w:rStyle w:val="Hyperlink"/>
@@ -9995,7 +9995,7 @@
             <w:noProof/>
             <w:webHidden/>
           </w:rPr>
-          <w:instrText xml:space="preserve"> PAGEREF _Toc244085981 \h </w:instrText>
+          <w:instrText xml:space="preserve"> PAGEREF _Toc244086118 \h </w:instrText>
         </w:r>
         <w:r>
           <w:rPr>
@@ -10042,7 +10042,7 @@
           <w14:ligatures w14:val="standardContextual"/>
         </w:rPr>
       </w:pPr>
-      <w:hyperlink w:anchor="_Toc244085982" w:history="1">
+      <w:hyperlink w:anchor="_Toc244086119" w:history="1">
         <w:r>
           <w:rPr>
             <w:rStyle w:val="Hyperlink"/>
@@ -10069,7 +10069,7 @@
             <w:noProof/>
             <w:webHidden/>
           </w:rPr>
-          <w:instrText xml:space="preserve"> PAGEREF _Toc244085982 \h </w:instrText>
+          <w:instrText xml:space="preserve"> PAGEREF _Toc244086119 \h </w:instrText>
         </w:r>
         <w:r>
           <w:rPr>
@@ -10116,7 +10116,7 @@
           <w14:ligatures w14:val="standardContextual"/>
         </w:rPr>
       </w:pPr>
-      <w:hyperlink w:anchor="_Toc244085983" w:history="1">
+      <w:hyperlink w:anchor="_Toc244086120" w:history="1">
         <w:r>
           <w:rPr>
             <w:rStyle w:val="Hyperlink"/>
@@ -10143,7 +10143,7 @@
             <w:noProof/>
             <w:webHidden/>
           </w:rPr>
-          <w:instrText xml:space="preserve"> PAGEREF _Toc244085983 \h </w:instrText>
+          <w:instrText xml:space="preserve"> PAGEREF _Toc244086120 \h </w:instrText>
         </w:r>
         <w:r>
           <w:rPr>
@@ -10190,7 +10190,7 @@
           <w14:ligatures w14:val="standardContextual"/>
         </w:rPr>
       </w:pPr>
-      <w:hyperlink w:anchor="_Toc244085984" w:history="1">
+      <w:hyperlink w:anchor="_Toc244086121" w:history="1">
         <w:r>
           <w:rPr>
             <w:rStyle w:val="Hyperlink"/>
@@ -10217,7 +10217,7 @@
             <w:noProof/>
             <w:webHidden/>
           </w:rPr>
-          <w:instrText xml:space="preserve"> PAGEREF _Toc244085984 \h </w:instrText>
+          <w:instrText xml:space="preserve"> PAGEREF _Toc244086121 \h </w:instrText>
         </w:r>
         <w:r>
           <w:rPr>
@@ -10265,7 +10265,7 @@
       <w:pPr>
         <w:pStyle w:val="Heading1"/>
       </w:pPr>
-      <w:bookmarkStart w:id="5" w:name="_Toc244085927"/>
+      <w:bookmarkStart w:id="5" w:name="_Toc244086064"/>
       <w:r>
         <w:rPr>
           <w:rFonts w:ascii="Times New Roman" w:hAnsi="Times New Roman"/>
@@ -10341,7 +10341,7 @@
       <w:r>
         <w:fldChar w:fldCharType="separate"/>
       </w:r>
-      <w:hyperlink w:anchor="_Toc244085985" w:history="1">
+      <w:hyperlink w:anchor="_Toc244086122" w:history="1">
         <w:r>
           <w:rPr>
             <w:rStyle w:val="Hyperlink"/>
@@ -10368,7 +10368,7 @@
             <w:noProof/>
             <w:webHidden/>
           </w:rPr>
-          <w:instrText xml:space="preserve"> PAGEREF _Toc244085985 \h </w:instrText>
+          <w:instrText xml:space="preserve"> PAGEREF _Toc244086122 \h </w:instrText>
         </w:r>
         <w:r>
           <w:rPr>
@@ -10415,7 +10415,7 @@
           <w14:ligatures w14:val="standardContextual"/>
         </w:rPr>
       </w:pPr>
-      <w:hyperlink w:anchor="_Toc244085986" w:history="1">
+      <w:hyperlink w:anchor="_Toc244086123" w:history="1">
         <w:r>
           <w:rPr>
             <w:rStyle w:val="Hyperlink"/>
@@ -10442,7 +10442,7 @@
             <w:noProof/>
             <w:webHidden/>
           </w:rPr>
-          <w:instrText xml:space="preserve"> PAGEREF _Toc244085986 \h </w:instrText>
+          <w:instrText xml:space="preserve"> PAGEREF _Toc244086123 \h </w:instrText>
         </w:r>
         <w:r>
           <w:rPr>
@@ -10489,7 +10489,7 @@
           <w14:ligatures w14:val="standardContextual"/>
         </w:rPr>
       </w:pPr>
-      <w:hyperlink w:anchor="_Toc244085987" w:history="1">
+      <w:hyperlink w:anchor="_Toc244086124" w:history="1">
         <w:r>
           <w:rPr>
             <w:rStyle w:val="Hyperlink"/>
@@ -10516,7 +10516,7 @@
             <w:noProof/>
             <w:webHidden/>
           </w:rPr>
-          <w:instrText xml:space="preserve"> PAGEREF _Toc244085987 \h </w:instrText>
+          <w:instrText xml:space="preserve"> PAGEREF _Toc244086124 \h </w:instrText>
         </w:r>
         <w:r>
           <w:rPr>
@@ -10563,7 +10563,7 @@
           <w14:ligatures w14:val="standardContextual"/>
         </w:rPr>
       </w:pPr>
-      <w:hyperlink w:anchor="_Toc244085988" w:history="1">
+      <w:hyperlink w:anchor="_Toc244086125" w:history="1">
         <w:r>
           <w:rPr>
             <w:rStyle w:val="Hyperlink"/>
@@ -10590,7 +10590,7 @@
             <w:noProof/>
             <w:webHidden/>
           </w:rPr>
-          <w:instrText xml:space="preserve"> PAGEREF _Toc244085988 \h </w:instrText>
+          <w:instrText xml:space="preserve"> PAGEREF _Toc244086125 \h </w:instrText>
         </w:r>
         <w:r>
           <w:rPr>
@@ -10637,7 +10637,7 @@
           <w14:ligatures w14:val="standardContextual"/>
         </w:rPr>
       </w:pPr>
-      <w:hyperlink w:anchor="_Toc244085989" w:history="1">
+      <w:hyperlink w:anchor="_Toc244086126" w:history="1">
         <w:r>
           <w:rPr>
             <w:rStyle w:val="Hyperlink"/>
@@ -10664,7 +10664,7 @@
             <w:noProof/>
             <w:webHidden/>
           </w:rPr>
-          <w:instrText xml:space="preserve"> PAGEREF _Toc244085989 \h </w:instrText>
+          <w:instrText xml:space="preserve"> PAGEREF _Toc244086126 \h </w:instrText>
         </w:r>
         <w:r>
           <w:rPr>
@@ -10711,7 +10711,7 @@
           <w14:ligatures w14:val="standardContextual"/>
         </w:rPr>
       </w:pPr>
-      <w:hyperlink w:anchor="_Toc244085990" w:history="1">
+      <w:hyperlink w:anchor="_Toc244086127" w:history="1">
         <w:r>
           <w:rPr>
             <w:rStyle w:val="Hyperlink"/>
@@ -10738,7 +10738,7 @@
             <w:noProof/>
             <w:webHidden/>
           </w:rPr>
-          <w:instrText xml:space="preserve"> PAGEREF _Toc244085990 \h </w:instrText>
+          <w:instrText xml:space="preserve"> PAGEREF _Toc244086127 \h </w:instrText>
         </w:r>
         <w:r>
           <w:rPr>
@@ -10785,7 +10785,7 @@
           <w14:ligatures w14:val="standardContextual"/>
         </w:rPr>
       </w:pPr>
-      <w:hyperlink w:anchor="_Toc244085991" w:history="1">
+      <w:hyperlink w:anchor="_Toc244086128" w:history="1">
         <w:r>
           <w:rPr>
             <w:rStyle w:val="Hyperlink"/>
@@ -10812,7 +10812,7 @@
             <w:noProof/>
             <w:webHidden/>
           </w:rPr>
-          <w:instrText xml:space="preserve"> PAGEREF _Toc244085991 \h </w:instrText>
+          <w:instrText xml:space="preserve"> PAGEREF _Toc244086128 \h </w:instrText>
         </w:r>
         <w:r>
           <w:rPr>
@@ -10859,7 +10859,7 @@
           <w14:ligatures w14:val="standardContextual"/>
         </w:rPr>
       </w:pPr>
-      <w:hyperlink w:anchor="_Toc244085992" w:history="1">
+      <w:hyperlink w:anchor="_Toc244086129" w:history="1">
         <w:r>
           <w:rPr>
             <w:rStyle w:val="Hyperlink"/>
@@ -10886,7 +10886,7 @@
             <w:noProof/>
             <w:webHidden/>
           </w:rPr>
-          <w:instrText xml:space="preserve"> PAGEREF _Toc244085992 \h </w:instrText>
+          <w:instrText xml:space="preserve"> PAGEREF _Toc244086129 \h </w:instrText>
         </w:r>
         <w:r>
           <w:rPr>
@@ -10933,7 +10933,7 @@
           <w14:ligatures w14:val="standardContextual"/>
         </w:rPr>
       </w:pPr>
-      <w:hyperlink w:anchor="_Toc244085993" w:history="1">
+      <w:hyperlink w:anchor="_Toc244086130" w:history="1">
         <w:r>
           <w:rPr>
             <w:rStyle w:val="Hyperlink"/>
@@ -10960,7 +10960,7 @@
             <w:noProof/>
             <w:webHidden/>
           </w:rPr>
-          <w:instrText xml:space="preserve"> PAGEREF _Toc244085993 \h </w:instrText>
+          <w:instrText xml:space="preserve"> PAGEREF _Toc244086130 \h </w:instrText>
         </w:r>
         <w:r>
           <w:rPr>
@@ -11007,7 +11007,7 @@
           <w14:ligatures w14:val="standardContextual"/>
         </w:rPr>
       </w:pPr>
-      <w:hyperlink w:anchor="_Toc244085994" w:history="1">
+      <w:hyperlink w:anchor="_Toc244086131" w:history="1">
         <w:r>
           <w:rPr>
             <w:rStyle w:val="Hyperlink"/>
@@ -11034,7 +11034,7 @@
             <w:noProof/>
             <w:webHidden/>
           </w:rPr>
-          <w:instrText xml:space="preserve"> PAGEREF _Toc244085994 \h </w:instrText>
+          <w:instrText xml:space="preserve"> PAGEREF _Toc244086131 \h </w:instrText>
         </w:r>
         <w:r>
           <w:rPr>
@@ -11081,7 +11081,7 @@
           <w14:ligatures w14:val="standardContextual"/>
         </w:rPr>
       </w:pPr>
-      <w:hyperlink w:anchor="_Toc244085995" w:history="1">
+      <w:hyperlink w:anchor="_Toc244086132" w:history="1">
         <w:r>
           <w:rPr>
             <w:rStyle w:val="Hyperlink"/>
@@ -11108,7 +11108,7 @@
             <w:noProof/>
             <w:webHidden/>
           </w:rPr>
-          <w:instrText xml:space="preserve"> PAGEREF _Toc244085995 \h </w:instrText>
+          <w:instrText xml:space="preserve"> PAGEREF _Toc244086132 \h </w:instrText>
         </w:r>
         <w:r>
           <w:rPr>
@@ -11155,7 +11155,7 @@
           <w14:ligatures w14:val="standardContextual"/>
         </w:rPr>
       </w:pPr>
-      <w:hyperlink w:anchor="_Toc244085996" w:history="1">
+      <w:hyperlink w:anchor="_Toc244086133" w:history="1">
         <w:r>
           <w:rPr>
             <w:rStyle w:val="Hyperlink"/>
@@ -11182,7 +11182,7 @@
             <w:noProof/>
             <w:webHidden/>
           </w:rPr>
-          <w:instrText xml:space="preserve"> PAGEREF _Toc244085996 \h </w:instrText>
+          <w:instrText xml:space="preserve"> PAGEREF _Toc244086133 \h </w:instrText>
         </w:r>
         <w:r>
           <w:rPr>
@@ -11229,7 +11229,7 @@
           <w14:ligatures w14:val="standardContextual"/>
         </w:rPr>
       </w:pPr>
-      <w:hyperlink w:anchor="_Toc244085997" w:history="1">
+      <w:hyperlink w:anchor="_Toc244086134" w:history="1">
         <w:r>
           <w:rPr>
             <w:rStyle w:val="Hyperlink"/>
@@ -11256,7 +11256,7 @@
             <w:noProof/>
             <w:webHidden/>
           </w:rPr>
-          <w:instrText xml:space="preserve"> PAGEREF _Toc244085997 \h </w:instrText>
+          <w:instrText xml:space="preserve"> PAGEREF _Toc244086134 \h </w:instrText>
         </w:r>
         <w:r>
           <w:rPr>
@@ -11303,7 +11303,7 @@
           <w14:ligatures w14:val="standardContextual"/>
         </w:rPr>
       </w:pPr>
-      <w:hyperlink w:anchor="_Toc244085998" w:history="1">
+      <w:hyperlink w:anchor="_Toc244086135" w:history="1">
         <w:r>
           <w:rPr>
             <w:rStyle w:val="Hyperlink"/>
@@ -11330,7 +11330,7 @@
             <w:noProof/>
             <w:webHidden/>
           </w:rPr>
-          <w:instrText xml:space="preserve"> PAGEREF _Toc244085998 \h </w:instrText>
+          <w:instrText xml:space="preserve"> PAGEREF _Toc244086135 \h </w:instrText>
         </w:r>
         <w:r>
           <w:rPr>
@@ -11377,7 +11377,7 @@
           <w14:ligatures w14:val="standardContextual"/>
         </w:rPr>
       </w:pPr>
-      <w:hyperlink w:anchor="_Toc244085999" w:history="1">
+      <w:hyperlink w:anchor="_Toc244086136" w:history="1">
         <w:r>
           <w:rPr>
             <w:rStyle w:val="Hyperlink"/>
@@ -11404,7 +11404,7 @@
             <w:noProof/>
             <w:webHidden/>
           </w:rPr>
-          <w:instrText xml:space="preserve"> PAGEREF _Toc244085999 \h </w:instrText>
+          <w:instrText xml:space="preserve"> PAGEREF _Toc244086136 \h </w:instrText>
         </w:r>
         <w:r>
           <w:rPr>
@@ -11451,7 +11451,7 @@
           <w14:ligatures w14:val="standardContextual"/>
         </w:rPr>
       </w:pPr>
-      <w:hyperlink w:anchor="_Toc244086000" w:history="1">
+      <w:hyperlink w:anchor="_Toc244086137" w:history="1">
         <w:r>
           <w:rPr>
             <w:rStyle w:val="Hyperlink"/>
@@ -11478,7 +11478,7 @@
             <w:noProof/>
             <w:webHidden/>
           </w:rPr>
-          <w:instrText xml:space="preserve"> PAGEREF _Toc244086000 \h </w:instrText>
+          <w:instrText xml:space="preserve"> PAGEREF _Toc244086137 \h </w:instrText>
         </w:r>
         <w:r>
           <w:rPr>
@@ -11525,7 +11525,7 @@
           <w14:ligatures w14:val="standardContextual"/>
         </w:rPr>
       </w:pPr>
-      <w:hyperlink w:anchor="_Toc244086001" w:history="1">
+      <w:hyperlink w:anchor="_Toc244086138" w:history="1">
         <w:r>
           <w:rPr>
             <w:rStyle w:val="Hyperlink"/>
@@ -11552,7 +11552,7 @@
             <w:noProof/>
             <w:webHidden/>
           </w:rPr>
-          <w:instrText xml:space="preserve"> PAGEREF _Toc244086001 \h </w:instrText>
+          <w:instrText xml:space="preserve"> PAGEREF _Toc244086138 \h </w:instrText>
         </w:r>
         <w:r>
           <w:rPr>
@@ -11599,7 +11599,7 @@
           <w14:ligatures w14:val="standardContextual"/>
         </w:rPr>
       </w:pPr>
-      <w:hyperlink w:anchor="_Toc244086002" w:history="1">
+      <w:hyperlink w:anchor="_Toc244086139" w:history="1">
         <w:r>
           <w:rPr>
             <w:rStyle w:val="Hyperlink"/>
@@ -11626,7 +11626,7 @@
             <w:noProof/>
             <w:webHidden/>
           </w:rPr>
-          <w:instrText xml:space="preserve"> PAGEREF _Toc244086002 \h </w:instrText>
+          <w:instrText xml:space="preserve"> PAGEREF _Toc244086139 \h </w:instrText>
         </w:r>
         <w:r>
           <w:rPr>
@@ -11688,7 +11688,7 @@
         <w:pStyle w:val="Heading1"/>
         <w:jc w:val="center"/>
       </w:pPr>
-      <w:bookmarkStart w:id="6" w:name="_Toc244085928"/>
+      <w:bookmarkStart w:id="6" w:name="_Toc244086065"/>
       <w:r>
         <w:rPr>
           <w:rFonts w:ascii="Times New Roman" w:hAnsi="Times New Roman"/>
@@ -11762,7 +11762,7 @@
       <w:pPr>
         <w:pStyle w:val="Heading2"/>
       </w:pPr>
-      <w:bookmarkStart w:id="7" w:name="_Toc244085929"/>
+      <w:bookmarkStart w:id="7" w:name="_Toc244086066"/>
       <w:r>
         <w:rPr>
           <w:rFonts w:ascii="Times New Roman" w:hAnsi="Times New Roman"/>
@@ -12337,7 +12337,7 @@
       <w:pPr>
         <w:pStyle w:val="Heading2"/>
       </w:pPr>
-      <w:bookmarkStart w:id="8" w:name="_Toc244085930"/>
+      <w:bookmarkStart w:id="8" w:name="_Toc244086067"/>
       <w:r>
         <w:rPr>
           <w:rFonts w:ascii="Times New Roman" w:hAnsi="Times New Roman"/>
@@ -13806,7 +13806,7 @@
       <w:pPr>
         <w:pStyle w:val="Heading2"/>
       </w:pPr>
-      <w:bookmarkStart w:id="9" w:name="_Toc244085931"/>
+      <w:bookmarkStart w:id="9" w:name="_Toc244086068"/>
       <w:r>
         <w:rPr>
           <w:rFonts w:ascii="Times New Roman" w:hAnsi="Times New Roman"/>
@@ -14025,7 +14025,7 @@
       <w:pPr>
         <w:pStyle w:val="TableCaption"/>
       </w:pPr>
-      <w:bookmarkStart w:id="10" w:name="_Toc244085973"/>
+      <w:bookmarkStart w:id="10" w:name="_Toc244086110"/>
       <w:r>
         <w:t>B</w:t>
       </w:r>
@@ -16717,7 +16717,7 @@
       <w:pPr>
         <w:pStyle w:val="Heading2"/>
       </w:pPr>
-      <w:bookmarkStart w:id="11" w:name="_Toc244085932"/>
+      <w:bookmarkStart w:id="11" w:name="_Toc244086069"/>
       <w:r>
         <w:rPr>
           <w:rFonts w:ascii="Times New Roman" w:hAnsi="Times New Roman"/>
@@ -16870,7 +16870,7 @@
       <w:pPr>
         <w:pStyle w:val="TableCaption"/>
       </w:pPr>
-      <w:bookmarkStart w:id="12" w:name="_Toc244085974"/>
+      <w:bookmarkStart w:id="12" w:name="_Toc244086111"/>
       <w:r>
         <w:t>B</w:t>
       </w:r>
@@ -19251,7 +19251,7 @@
       <w:pPr>
         <w:pStyle w:val="Heading3"/>
       </w:pPr>
-      <w:bookmarkStart w:id="13" w:name="_Toc244085933"/>
+      <w:bookmarkStart w:id="13" w:name="_Toc244086070"/>
       <w:r>
         <w:rPr>
           <w:rFonts w:ascii="Times New Roman" w:hAnsi="Times New Roman"/>
@@ -19428,7 +19428,7 @@
       <w:pPr>
         <w:pStyle w:val="Heading3"/>
       </w:pPr>
-      <w:bookmarkStart w:id="14" w:name="_Toc244085934"/>
+      <w:bookmarkStart w:id="14" w:name="_Toc244086071"/>
       <w:r>
         <w:rPr>
           <w:rFonts w:ascii="Times New Roman" w:hAnsi="Times New Roman"/>
@@ -19635,7 +19635,7 @@
       <w:pPr>
         <w:pStyle w:val="Heading3"/>
       </w:pPr>
-      <w:bookmarkStart w:id="15" w:name="_Toc244085935"/>
+      <w:bookmarkStart w:id="15" w:name="_Toc244086072"/>
       <w:r>
         <w:rPr>
           <w:rFonts w:ascii="Times New Roman" w:hAnsi="Times New Roman"/>
@@ -19885,7 +19885,7 @@
         <w:pStyle w:val="Heading1"/>
         <w:jc w:val="center"/>
       </w:pPr>
-      <w:bookmarkStart w:id="16" w:name="_Toc244085936"/>
+      <w:bookmarkStart w:id="16" w:name="_Toc244086073"/>
       <w:r>
         <w:rPr>
           <w:rFonts w:ascii="Times New Roman" w:hAnsi="Times New Roman"/>
@@ -19947,7 +19947,7 @@
       <w:pPr>
         <w:pStyle w:val="Heading2"/>
       </w:pPr>
-      <w:bookmarkStart w:id="17" w:name="_Toc244085937"/>
+      <w:bookmarkStart w:id="17" w:name="_Toc244086074"/>
       <w:r>
         <w:rPr>
           <w:rFonts w:ascii="Times New Roman" w:hAnsi="Times New Roman"/>
@@ -20660,7 +20660,7 @@
       <w:pPr>
         <w:pStyle w:val="Heading2"/>
       </w:pPr>
-      <w:bookmarkStart w:id="18" w:name="_Toc244085938"/>
+      <w:bookmarkStart w:id="18" w:name="_Toc244086075"/>
       <w:r>
         <w:rPr>
           <w:rFonts w:ascii="Times New Roman" w:hAnsi="Times New Roman"/>
@@ -20843,7 +20843,7 @@
       <w:pPr>
         <w:pStyle w:val="Heading2"/>
       </w:pPr>
-      <w:bookmarkStart w:id="19" w:name="_Toc244085939"/>
+      <w:bookmarkStart w:id="19" w:name="_Toc244086076"/>
       <w:r>
         <w:rPr>
           <w:rFonts w:ascii="Times New Roman" w:hAnsi="Times New Roman"/>
@@ -20982,7 +20982,7 @@
       <w:pPr>
         <w:pStyle w:val="Heading2"/>
       </w:pPr>
-      <w:bookmarkStart w:id="20" w:name="_Toc244085940"/>
+      <w:bookmarkStart w:id="20" w:name="_Toc244086077"/>
       <w:r>
         <w:rPr>
           <w:rFonts w:ascii="Times New Roman" w:hAnsi="Times New Roman"/>
@@ -21159,7 +21159,7 @@
       <w:pPr>
         <w:pStyle w:val="Heading2"/>
       </w:pPr>
-      <w:bookmarkStart w:id="21" w:name="_Toc244085941"/>
+      <w:bookmarkStart w:id="21" w:name="_Toc244086078"/>
       <w:r>
         <w:rPr>
           <w:rFonts w:ascii="Times New Roman" w:hAnsi="Times New Roman"/>
@@ -21414,7 +21414,7 @@
       <w:pPr>
         <w:pStyle w:val="Heading2"/>
       </w:pPr>
-      <w:bookmarkStart w:id="22" w:name="_Toc244085942"/>
+      <w:bookmarkStart w:id="22" w:name="_Toc244086079"/>
       <w:r>
         <w:rPr>
           <w:rFonts w:ascii="Times New Roman" w:hAnsi="Times New Roman"/>
@@ -21603,7 +21603,7 @@
         <w:pStyle w:val="Heading1"/>
         <w:jc w:val="center"/>
       </w:pPr>
-      <w:bookmarkStart w:id="23" w:name="_Toc244085943"/>
+      <w:bookmarkStart w:id="23" w:name="_Toc244086080"/>
       <w:r>
         <w:rPr>
           <w:rFonts w:ascii="Times New Roman" w:hAnsi="Times New Roman"/>
@@ -21653,7 +21653,7 @@
       <w:pPr>
         <w:pStyle w:val="Heading2"/>
       </w:pPr>
-      <w:bookmarkStart w:id="24" w:name="_Toc244085944"/>
+      <w:bookmarkStart w:id="24" w:name="_Toc244086081"/>
       <w:r>
         <w:rPr>
           <w:rFonts w:ascii="Times New Roman" w:hAnsi="Times New Roman"/>
@@ -21801,7 +21801,7 @@
           <w:noProof/>
         </w:rPr>
         <w:drawing>
-          <wp:inline distT="0" distB="0" distL="0" distR="0" wp14:anchorId="2F30F209" wp14:editId="03C2001E">
+          <wp:inline distT="0" distB="0" distL="0" distR="0" wp14:anchorId="6DEAD6BB" wp14:editId="653CA9C2">
             <wp:extent cx="5486400" cy="3086100"/>
             <wp:effectExtent l="0" t="0" r="0" b="0"/>
             <wp:docPr id="3" name="Picture 3"/>
@@ -21842,7 +21842,7 @@
         <w:pStyle w:val="FigureCaption"/>
         <w:jc w:val="center"/>
       </w:pPr>
-      <w:bookmarkStart w:id="25" w:name="_Toc244085985"/>
+      <w:bookmarkStart w:id="25" w:name="_Toc244086122"/>
       <w:r>
         <w:t>Hình 3.1: Giao di</w:t>
       </w:r>
@@ -21882,7 +21882,7 @@
       <w:pPr>
         <w:pStyle w:val="Heading2"/>
       </w:pPr>
-      <w:bookmarkStart w:id="26" w:name="_Toc244085945"/>
+      <w:bookmarkStart w:id="26" w:name="_Toc244086082"/>
       <w:r>
         <w:rPr>
           <w:rFonts w:ascii="Times New Roman" w:hAnsi="Times New Roman"/>
@@ -22025,7 +22025,7 @@
         </w:rPr>
         <w:lastRenderedPageBreak/>
         <w:drawing>
-          <wp:inline distT="0" distB="0" distL="0" distR="0" wp14:anchorId="448B1EE5" wp14:editId="282D002C">
+          <wp:inline distT="0" distB="0" distL="0" distR="0" wp14:anchorId="634971FC" wp14:editId="13A6A9B7">
             <wp:extent cx="5486400" cy="3086100"/>
             <wp:effectExtent l="0" t="0" r="0" b="0"/>
             <wp:docPr id="4" name="Picture 4"/>
@@ -22066,7 +22066,7 @@
         <w:pStyle w:val="FigureCaption"/>
         <w:jc w:val="center"/>
       </w:pPr>
-      <w:bookmarkStart w:id="27" w:name="_Toc244085986"/>
+      <w:bookmarkStart w:id="27" w:name="_Toc244086123"/>
       <w:r>
         <w:t>Hình 3.2: Khám phá Schema 26 c</w:t>
       </w:r>
@@ -22546,7 +22546,7 @@
         </w:rPr>
         <w:lastRenderedPageBreak/>
         <w:drawing>
-          <wp:inline distT="0" distB="0" distL="0" distR="0" wp14:anchorId="616C6EAD" wp14:editId="17DEC2C2">
+          <wp:inline distT="0" distB="0" distL="0" distR="0" wp14:anchorId="7BC98ACC" wp14:editId="7DDEB296">
             <wp:extent cx="5486400" cy="2365904"/>
             <wp:effectExtent l="0" t="0" r="0" b="0"/>
             <wp:docPr id="5" name="Picture 5"/>
@@ -22587,7 +22587,7 @@
         <w:pStyle w:val="FigureCaption"/>
         <w:jc w:val="center"/>
       </w:pPr>
-      <w:bookmarkStart w:id="28" w:name="_Toc244085987"/>
+      <w:bookmarkStart w:id="28" w:name="_Toc244086124"/>
       <w:r>
         <w:t>Hình 3.3: K</w:t>
       </w:r>
@@ -22639,7 +22639,7 @@
       <w:pPr>
         <w:pStyle w:val="Heading2"/>
       </w:pPr>
-      <w:bookmarkStart w:id="29" w:name="_Toc244085946"/>
+      <w:bookmarkStart w:id="29" w:name="_Toc244086083"/>
       <w:r>
         <w:rPr>
           <w:rFonts w:ascii="Times New Roman" w:hAnsi="Times New Roman"/>
@@ -22745,7 +22745,7 @@
           <w:noProof/>
         </w:rPr>
         <w:drawing>
-          <wp:inline distT="0" distB="0" distL="0" distR="0" wp14:anchorId="57E25322" wp14:editId="209C2435">
+          <wp:inline distT="0" distB="0" distL="0" distR="0" wp14:anchorId="637615B5" wp14:editId="442BAC47">
             <wp:extent cx="5486400" cy="3086100"/>
             <wp:effectExtent l="0" t="0" r="0" b="0"/>
             <wp:docPr id="6" name="Picture 6"/>
@@ -22786,7 +22786,7 @@
         <w:pStyle w:val="FigureCaption"/>
         <w:jc w:val="center"/>
       </w:pPr>
-      <w:bookmarkStart w:id="30" w:name="_Toc244085988"/>
+      <w:bookmarkStart w:id="30" w:name="_Toc244086125"/>
       <w:r>
         <w:t>Hình 3.4: Kafka Producer phát sóng s</w:t>
       </w:r>
@@ -22846,7 +22846,7 @@
         </w:rPr>
         <w:lastRenderedPageBreak/>
         <w:drawing>
-          <wp:inline distT="0" distB="0" distL="0" distR="0" wp14:anchorId="2125CB77" wp14:editId="41FB4F46">
+          <wp:inline distT="0" distB="0" distL="0" distR="0" wp14:anchorId="5A7CEC5E" wp14:editId="0584C46B">
             <wp:extent cx="5486400" cy="3086100"/>
             <wp:effectExtent l="0" t="0" r="0" b="0"/>
             <wp:docPr id="7" name="Picture 7"/>
@@ -22887,7 +22887,7 @@
         <w:pStyle w:val="FigureCaption"/>
         <w:jc w:val="center"/>
       </w:pPr>
-      <w:bookmarkStart w:id="31" w:name="_Toc244085989"/>
+      <w:bookmarkStart w:id="31" w:name="_Toc244086126"/>
       <w:r>
         <w:t>Hình 3.5: Kafka Consumer l</w:t>
       </w:r>
@@ -22939,7 +22939,7 @@
       <w:pPr>
         <w:pStyle w:val="Heading2"/>
       </w:pPr>
-      <w:bookmarkStart w:id="32" w:name="_Toc244085947"/>
+      <w:bookmarkStart w:id="32" w:name="_Toc244086084"/>
       <w:r>
         <w:rPr>
           <w:rFonts w:ascii="Times New Roman" w:hAnsi="Times New Roman"/>
@@ -23064,7 +23064,7 @@
         </w:rPr>
         <w:lastRenderedPageBreak/>
         <w:drawing>
-          <wp:inline distT="0" distB="0" distL="0" distR="0" wp14:anchorId="611D0F5D" wp14:editId="32E341F2">
+          <wp:inline distT="0" distB="0" distL="0" distR="0" wp14:anchorId="516FF06C" wp14:editId="4E6737E0">
             <wp:extent cx="5486400" cy="3112810"/>
             <wp:effectExtent l="0" t="0" r="0" b="0"/>
             <wp:docPr id="8" name="Picture 8"/>
@@ -23105,7 +23105,7 @@
         <w:pStyle w:val="FigureCaption"/>
         <w:jc w:val="center"/>
       </w:pPr>
-      <w:bookmarkStart w:id="33" w:name="_Toc244085990"/>
+      <w:bookmarkStart w:id="33" w:name="_Toc244086127"/>
       <w:r>
         <w:t>Hình 3.6: Giao di</w:t>
       </w:r>
@@ -23205,7 +23205,7 @@
         </w:rPr>
         <w:lastRenderedPageBreak/>
         <w:drawing>
-          <wp:inline distT="0" distB="0" distL="0" distR="0" wp14:anchorId="5365AE9D" wp14:editId="7EE8A4BB">
+          <wp:inline distT="0" distB="0" distL="0" distR="0" wp14:anchorId="68D761A4" wp14:editId="29C9C58B">
             <wp:extent cx="5486400" cy="3112810"/>
             <wp:effectExtent l="0" t="0" r="0" b="0"/>
             <wp:docPr id="9" name="Picture 9"/>
@@ -23246,7 +23246,7 @@
         <w:pStyle w:val="FigureCaption"/>
         <w:jc w:val="center"/>
       </w:pPr>
-      <w:bookmarkStart w:id="34" w:name="_Toc244085991"/>
+      <w:bookmarkStart w:id="34" w:name="_Toc244086128"/>
       <w:r>
         <w:t>Hình 3.7: Giao di</w:t>
       </w:r>
@@ -23316,7 +23316,7 @@
       <w:pPr>
         <w:pStyle w:val="Heading2"/>
       </w:pPr>
-      <w:bookmarkStart w:id="35" w:name="_Toc244085948"/>
+      <w:bookmarkStart w:id="35" w:name="_Toc244086085"/>
       <w:r>
         <w:rPr>
           <w:rFonts w:ascii="Times New Roman" w:hAnsi="Times New Roman"/>
@@ -23433,7 +23433,7 @@
         <w:pStyle w:val="Heading1"/>
         <w:jc w:val="center"/>
       </w:pPr>
-      <w:bookmarkStart w:id="36" w:name="_Toc244085949"/>
+      <w:bookmarkStart w:id="36" w:name="_Toc244086086"/>
       <w:r>
         <w:rPr>
           <w:rFonts w:ascii="Times New Roman" w:hAnsi="Times New Roman"/>
@@ -23495,7 +23495,7 @@
       <w:pPr>
         <w:pStyle w:val="Heading2"/>
       </w:pPr>
-      <w:bookmarkStart w:id="37" w:name="_Toc244085950"/>
+      <w:bookmarkStart w:id="37" w:name="_Toc244086087"/>
       <w:r>
         <w:rPr>
           <w:rFonts w:ascii="Times New Roman" w:hAnsi="Times New Roman"/>
@@ -23571,7 +23571,7 @@
           <w:noProof/>
         </w:rPr>
         <w:drawing>
-          <wp:inline distT="0" distB="0" distL="0" distR="0" wp14:anchorId="3E04A91F" wp14:editId="53D8E898">
+          <wp:inline distT="0" distB="0" distL="0" distR="0" wp14:anchorId="3CAC2DBA" wp14:editId="3463164E">
             <wp:extent cx="5486400" cy="3112810"/>
             <wp:effectExtent l="0" t="0" r="0" b="0"/>
             <wp:docPr id="10" name="Picture 10"/>
@@ -23612,7 +23612,7 @@
         <w:pStyle w:val="FigureCaption"/>
         <w:jc w:val="center"/>
       </w:pPr>
-      <w:bookmarkStart w:id="38" w:name="_Toc244085992"/>
+      <w:bookmarkStart w:id="38" w:name="_Toc244086129"/>
       <w:r>
         <w:t>Hình 4.1: Giao di</w:t>
       </w:r>
@@ -23688,7 +23688,7 @@
       <w:pPr>
         <w:pStyle w:val="Heading3"/>
       </w:pPr>
-      <w:bookmarkStart w:id="39" w:name="_Toc244085951"/>
+      <w:bookmarkStart w:id="39" w:name="_Toc244086088"/>
       <w:r>
         <w:rPr>
           <w:rFonts w:ascii="Times New Roman" w:hAnsi="Times New Roman"/>
@@ -23809,7 +23809,7 @@
       <w:pPr>
         <w:pStyle w:val="TableCaption"/>
       </w:pPr>
-      <w:bookmarkStart w:id="40" w:name="_Toc244085975"/>
+      <w:bookmarkStart w:id="40" w:name="_Toc244086112"/>
       <w:r>
         <w:t>B</w:t>
       </w:r>
@@ -25654,7 +25654,7 @@
       <w:pPr>
         <w:pStyle w:val="Heading3"/>
       </w:pPr>
-      <w:bookmarkStart w:id="41" w:name="_Toc244085952"/>
+      <w:bookmarkStart w:id="41" w:name="_Toc244086089"/>
       <w:r>
         <w:rPr>
           <w:rFonts w:ascii="Times New Roman" w:hAnsi="Times New Roman"/>
@@ -25751,7 +25751,7 @@
       <w:pPr>
         <w:pStyle w:val="TableCaption"/>
       </w:pPr>
-      <w:bookmarkStart w:id="42" w:name="_Toc244085976"/>
+      <w:bookmarkStart w:id="42" w:name="_Toc244086113"/>
       <w:r>
         <w:t>B</w:t>
       </w:r>
@@ -26741,7 +26741,7 @@
       <w:pPr>
         <w:pStyle w:val="Heading3"/>
       </w:pPr>
-      <w:bookmarkStart w:id="43" w:name="_Toc244085953"/>
+      <w:bookmarkStart w:id="43" w:name="_Toc244086090"/>
       <w:r>
         <w:rPr>
           <w:rFonts w:ascii="Times New Roman" w:hAnsi="Times New Roman"/>
@@ -26966,7 +26966,7 @@
       <w:pPr>
         <w:pStyle w:val="Heading3"/>
       </w:pPr>
-      <w:bookmarkStart w:id="44" w:name="_Toc244085954"/>
+      <w:bookmarkStart w:id="44" w:name="_Toc244086091"/>
       <w:r>
         <w:rPr>
           <w:rFonts w:ascii="Times New Roman" w:hAnsi="Times New Roman"/>
@@ -27492,7 +27492,7 @@
       <w:pPr>
         <w:pStyle w:val="Heading2"/>
       </w:pPr>
-      <w:bookmarkStart w:id="45" w:name="_Toc244085955"/>
+      <w:bookmarkStart w:id="45" w:name="_Toc244086092"/>
       <w:r>
         <w:rPr>
           <w:rFonts w:ascii="Times New Roman" w:hAnsi="Times New Roman"/>
@@ -27682,7 +27682,7 @@
           <w:noProof/>
         </w:rPr>
         <w:drawing>
-          <wp:inline distT="0" distB="0" distL="0" distR="0" wp14:anchorId="4360035C" wp14:editId="556DA8BA">
+          <wp:inline distT="0" distB="0" distL="0" distR="0" wp14:anchorId="585B9117" wp14:editId="4BDA08A1">
             <wp:extent cx="5486400" cy="3086100"/>
             <wp:effectExtent l="0" t="0" r="0" b="0"/>
             <wp:docPr id="11" name="Picture 11"/>
@@ -27723,7 +27723,7 @@
         <w:pStyle w:val="FigureCaption"/>
         <w:jc w:val="center"/>
       </w:pPr>
-      <w:bookmarkStart w:id="46" w:name="_Toc244085993"/>
+      <w:bookmarkStart w:id="46" w:name="_Toc244086130"/>
       <w:r>
         <w:t>Hình 4.2: VS Code Terminal th</w:t>
       </w:r>
@@ -27745,7 +27745,7 @@
       <w:pPr>
         <w:pStyle w:val="TableCaption"/>
       </w:pPr>
-      <w:bookmarkStart w:id="47" w:name="_Toc244085977"/>
+      <w:bookmarkStart w:id="47" w:name="_Toc244086114"/>
       <w:r>
         <w:t>B</w:t>
       </w:r>
@@ -28759,7 +28759,7 @@
       <w:pPr>
         <w:pStyle w:val="Heading2"/>
       </w:pPr>
-      <w:bookmarkStart w:id="48" w:name="_Toc244085956"/>
+      <w:bookmarkStart w:id="48" w:name="_Toc244086093"/>
       <w:r>
         <w:rPr>
           <w:rFonts w:ascii="Times New Roman" w:hAnsi="Times New Roman"/>
@@ -28889,7 +28889,7 @@
           <w:noProof/>
         </w:rPr>
         <w:drawing>
-          <wp:inline distT="0" distB="0" distL="0" distR="0" wp14:anchorId="6AEECC46" wp14:editId="661F7810">
+          <wp:inline distT="0" distB="0" distL="0" distR="0" wp14:anchorId="0689EA33" wp14:editId="73EA549B">
             <wp:extent cx="5486400" cy="3086100"/>
             <wp:effectExtent l="0" t="0" r="0" b="0"/>
             <wp:docPr id="12" name="Picture 12"/>
@@ -28930,7 +28930,7 @@
         <w:pStyle w:val="FigureCaption"/>
         <w:jc w:val="center"/>
       </w:pPr>
-      <w:bookmarkStart w:id="49" w:name="_Toc244085994"/>
+      <w:bookmarkStart w:id="49" w:name="_Toc244086131"/>
       <w:r>
         <w:t>Hình 4.3: VS Code Terminal hu</w:t>
       </w:r>
@@ -28958,7 +28958,7 @@
       <w:pPr>
         <w:pStyle w:val="TableCaption"/>
       </w:pPr>
-      <w:bookmarkStart w:id="50" w:name="_Toc244085978"/>
+      <w:bookmarkStart w:id="50" w:name="_Toc244086115"/>
       <w:r>
         <w:lastRenderedPageBreak/>
         <w:t>B</w:t>
@@ -29851,7 +29851,7 @@
       <w:pPr>
         <w:pStyle w:val="Heading2"/>
       </w:pPr>
-      <w:bookmarkStart w:id="51" w:name="_Toc244085957"/>
+      <w:bookmarkStart w:id="51" w:name="_Toc244086094"/>
       <w:r>
         <w:rPr>
           <w:rFonts w:ascii="Times New Roman" w:hAnsi="Times New Roman"/>
@@ -31669,7 +31669,7 @@
         </w:rPr>
         <w:lastRenderedPageBreak/>
         <w:drawing>
-          <wp:inline distT="0" distB="0" distL="0" distR="0" wp14:anchorId="604DE789" wp14:editId="27B857ED">
+          <wp:inline distT="0" distB="0" distL="0" distR="0" wp14:anchorId="7FBCB358" wp14:editId="05392CAF">
             <wp:extent cx="5486400" cy="3286065"/>
             <wp:effectExtent l="0" t="0" r="0" b="0"/>
             <wp:docPr id="13" name="Picture 13"/>
@@ -31710,7 +31710,7 @@
         <w:pStyle w:val="FigureCaption"/>
         <w:jc w:val="center"/>
       </w:pPr>
-      <w:bookmarkStart w:id="52" w:name="_Toc244085995"/>
+      <w:bookmarkStart w:id="52" w:name="_Toc244086132"/>
       <w:r>
         <w:t>Hình 4.4: Giao di</w:t>
       </w:r>
@@ -31776,7 +31776,7 @@
         </w:rPr>
         <w:lastRenderedPageBreak/>
         <w:drawing>
-          <wp:inline distT="0" distB="0" distL="0" distR="0" wp14:anchorId="6611DAD0" wp14:editId="560454D9">
+          <wp:inline distT="0" distB="0" distL="0" distR="0" wp14:anchorId="7D73F6D5" wp14:editId="64D15199">
             <wp:extent cx="5486400" cy="3286065"/>
             <wp:effectExtent l="0" t="0" r="0" b="0"/>
             <wp:docPr id="14" name="Picture 14"/>
@@ -31817,7 +31817,7 @@
         <w:pStyle w:val="FigureCaption"/>
         <w:jc w:val="center"/>
       </w:pPr>
-      <w:bookmarkStart w:id="53" w:name="_Toc244085996"/>
+      <w:bookmarkStart w:id="53" w:name="_Toc244086133"/>
       <w:r>
         <w:t>Hình 4.5: Giao di</w:t>
       </w:r>
@@ -31889,7 +31889,7 @@
         </w:rPr>
         <w:lastRenderedPageBreak/>
         <w:drawing>
-          <wp:inline distT="0" distB="0" distL="0" distR="0" wp14:anchorId="7F37E943" wp14:editId="1EFCA6C7">
+          <wp:inline distT="0" distB="0" distL="0" distR="0" wp14:anchorId="4D343D1D" wp14:editId="681955E7">
             <wp:extent cx="5486400" cy="3286065"/>
             <wp:effectExtent l="0" t="0" r="0" b="0"/>
             <wp:docPr id="15" name="Picture 15"/>
@@ -31930,7 +31930,7 @@
         <w:pStyle w:val="FigureCaption"/>
         <w:jc w:val="center"/>
       </w:pPr>
-      <w:bookmarkStart w:id="54" w:name="_Toc244085997"/>
+      <w:bookmarkStart w:id="54" w:name="_Toc244086134"/>
       <w:r>
         <w:t>Hình 4.6: Giao di</w:t>
       </w:r>
@@ -31972,7 +31972,7 @@
         </w:rPr>
         <w:lastRenderedPageBreak/>
         <w:drawing>
-          <wp:inline distT="0" distB="0" distL="0" distR="0" wp14:anchorId="5D96E873" wp14:editId="01605A8C">
+          <wp:inline distT="0" distB="0" distL="0" distR="0" wp14:anchorId="2F016CFD" wp14:editId="64BEF93A">
             <wp:extent cx="5486400" cy="3632574"/>
             <wp:effectExtent l="0" t="0" r="0" b="0"/>
             <wp:docPr id="16" name="Picture 16"/>
@@ -32013,7 +32013,7 @@
         <w:pStyle w:val="FigureCaption"/>
         <w:jc w:val="center"/>
       </w:pPr>
-      <w:bookmarkStart w:id="55" w:name="_Toc244085998"/>
+      <w:bookmarkStart w:id="55" w:name="_Toc244086135"/>
       <w:r>
         <w:t>Hình 4.7: Giao di</w:t>
       </w:r>
@@ -32073,7 +32073,7 @@
         </w:rPr>
         <w:lastRenderedPageBreak/>
         <w:drawing>
-          <wp:inline distT="0" distB="0" distL="0" distR="0" wp14:anchorId="687E6D5F" wp14:editId="5536BE69">
+          <wp:inline distT="0" distB="0" distL="0" distR="0" wp14:anchorId="0D6C25AD" wp14:editId="08EE1E24">
             <wp:extent cx="5486400" cy="3286065"/>
             <wp:effectExtent l="0" t="0" r="0" b="0"/>
             <wp:docPr id="17" name="Picture 17"/>
@@ -32114,7 +32114,7 @@
         <w:pStyle w:val="FigureCaption"/>
         <w:jc w:val="center"/>
       </w:pPr>
-      <w:bookmarkStart w:id="56" w:name="_Toc244085999"/>
+      <w:bookmarkStart w:id="56" w:name="_Toc244086136"/>
       <w:r>
         <w:t>Hình 4.8: Giao di</w:t>
       </w:r>
@@ -32197,7 +32197,7 @@
           <w:noProof/>
         </w:rPr>
         <w:drawing>
-          <wp:inline distT="0" distB="0" distL="0" distR="0" wp14:anchorId="3033B2D7" wp14:editId="4A609CC6">
+          <wp:inline distT="0" distB="0" distL="0" distR="0" wp14:anchorId="3206F8B6" wp14:editId="50802958">
             <wp:extent cx="5486400" cy="2676856"/>
             <wp:effectExtent l="0" t="0" r="0" b="0"/>
             <wp:docPr id="18" name="Picture 18"/>
@@ -32238,7 +32238,7 @@
         <w:pStyle w:val="FigureCaption"/>
         <w:jc w:val="center"/>
       </w:pPr>
-      <w:bookmarkStart w:id="57" w:name="_Toc244086000"/>
+      <w:bookmarkStart w:id="57" w:name="_Toc244086137"/>
       <w:r>
         <w:t>Hình 4.9: Giao di</w:t>
       </w:r>
@@ -32310,7 +32310,7 @@
         </w:rPr>
         <w:lastRenderedPageBreak/>
         <w:drawing>
-          <wp:inline distT="0" distB="0" distL="0" distR="0" wp14:anchorId="776B3A62" wp14:editId="67ABB55D">
+          <wp:inline distT="0" distB="0" distL="0" distR="0" wp14:anchorId="5FBEFCE5" wp14:editId="3CF8B48F">
             <wp:extent cx="5486400" cy="2676856"/>
             <wp:effectExtent l="0" t="0" r="0" b="0"/>
             <wp:docPr id="19" name="Picture 19"/>
@@ -32351,7 +32351,7 @@
         <w:pStyle w:val="FigureCaption"/>
         <w:jc w:val="center"/>
       </w:pPr>
-      <w:bookmarkStart w:id="58" w:name="_Toc244086001"/>
+      <w:bookmarkStart w:id="58" w:name="_Toc244086138"/>
       <w:r>
         <w:t>Hình 4.10: Giao di</w:t>
       </w:r>
@@ -32422,7 +32422,7 @@
           <w:noProof/>
         </w:rPr>
         <w:drawing>
-          <wp:inline distT="0" distB="0" distL="0" distR="0" wp14:anchorId="4159A30D" wp14:editId="26D103A3">
+          <wp:inline distT="0" distB="0" distL="0" distR="0" wp14:anchorId="2C33A3D9" wp14:editId="542183C3">
             <wp:extent cx="5486400" cy="3286065"/>
             <wp:effectExtent l="0" t="0" r="0" b="0"/>
             <wp:docPr id="20" name="Picture 20"/>
@@ -32463,7 +32463,7 @@
         <w:pStyle w:val="FigureCaption"/>
         <w:jc w:val="center"/>
       </w:pPr>
-      <w:bookmarkStart w:id="59" w:name="_Toc244086002"/>
+      <w:bookmarkStart w:id="59" w:name="_Toc244086139"/>
       <w:r>
         <w:t>Hình 4.11: Giao di</w:t>
       </w:r>
@@ -32527,7 +32527,7 @@
       <w:pPr>
         <w:pStyle w:val="Heading2"/>
       </w:pPr>
-      <w:bookmarkStart w:id="60" w:name="_Toc244085958"/>
+      <w:bookmarkStart w:id="60" w:name="_Toc244086095"/>
       <w:r>
         <w:rPr>
           <w:rFonts w:ascii="Times New Roman" w:hAnsi="Times New Roman"/>
@@ -32879,7 +32879,7 @@
       <w:pPr>
         <w:pStyle w:val="TableCaption"/>
       </w:pPr>
-      <w:bookmarkStart w:id="61" w:name="_Toc244085979"/>
+      <w:bookmarkStart w:id="61" w:name="_Toc244086116"/>
       <w:r>
         <w:t>B</w:t>
       </w:r>
@@ -35263,7 +35263,7 @@
       <w:pPr>
         <w:pStyle w:val="Heading2"/>
       </w:pPr>
-      <w:bookmarkStart w:id="62" w:name="_Toc244085959"/>
+      <w:bookmarkStart w:id="62" w:name="_Toc244086096"/>
       <w:r>
         <w:rPr>
           <w:rFonts w:ascii="Times New Roman" w:hAnsi="Times New Roman"/>
@@ -35361,7 +35361,7 @@
       <w:pPr>
         <w:pStyle w:val="TableCaption"/>
       </w:pPr>
-      <w:bookmarkStart w:id="63" w:name="_Toc244085980"/>
+      <w:bookmarkStart w:id="63" w:name="_Toc244086117"/>
       <w:r>
         <w:t>B</w:t>
       </w:r>
@@ -37704,7 +37704,7 @@
         <w:pStyle w:val="Heading1"/>
         <w:jc w:val="center"/>
       </w:pPr>
-      <w:bookmarkStart w:id="64" w:name="_Toc244085960"/>
+      <w:bookmarkStart w:id="64" w:name="_Toc244086097"/>
       <w:r>
         <w:rPr>
           <w:rFonts w:ascii="Times New Roman" w:hAnsi="Times New Roman"/>
@@ -37778,7 +37778,7 @@
       <w:pPr>
         <w:pStyle w:val="Heading2"/>
       </w:pPr>
-      <w:bookmarkStart w:id="65" w:name="_Toc244085961"/>
+      <w:bookmarkStart w:id="65" w:name="_Toc244086098"/>
       <w:r>
         <w:rPr>
           <w:rFonts w:ascii="Times New Roman" w:hAnsi="Times New Roman"/>
@@ -38227,7 +38227,7 @@
       <w:pPr>
         <w:pStyle w:val="Heading2"/>
       </w:pPr>
-      <w:bookmarkStart w:id="66" w:name="_Toc244085962"/>
+      <w:bookmarkStart w:id="66" w:name="_Toc244086099"/>
       <w:r>
         <w:rPr>
           <w:rFonts w:ascii="Times New Roman" w:hAnsi="Times New Roman"/>
@@ -38336,7 +38336,7 @@
       <w:pPr>
         <w:pStyle w:val="TableCaption"/>
       </w:pPr>
-      <w:bookmarkStart w:id="67" w:name="_Toc244085981"/>
+      <w:bookmarkStart w:id="67" w:name="_Toc244086118"/>
       <w:r>
         <w:t>B</w:t>
       </w:r>
@@ -40120,7 +40120,7 @@
       <w:pPr>
         <w:pStyle w:val="Heading2"/>
       </w:pPr>
-      <w:bookmarkStart w:id="68" w:name="_Toc244085963"/>
+      <w:bookmarkStart w:id="68" w:name="_Toc244086100"/>
       <w:r>
         <w:rPr>
           <w:rFonts w:ascii="Times New Roman" w:hAnsi="Times New Roman"/>
@@ -40259,7 +40259,7 @@
       <w:pPr>
         <w:pStyle w:val="TableCaption"/>
       </w:pPr>
-      <w:bookmarkStart w:id="69" w:name="_Toc244085982"/>
+      <w:bookmarkStart w:id="69" w:name="_Toc244086119"/>
       <w:r>
         <w:t>B</w:t>
       </w:r>
@@ -41655,7 +41655,7 @@
       <w:pPr>
         <w:pStyle w:val="Heading2"/>
       </w:pPr>
-      <w:bookmarkStart w:id="70" w:name="_Toc244085964"/>
+      <w:bookmarkStart w:id="70" w:name="_Toc244086101"/>
       <w:r>
         <w:rPr>
           <w:rFonts w:ascii="Times New Roman" w:hAnsi="Times New Roman"/>
@@ -41770,7 +41770,7 @@
       <w:pPr>
         <w:pStyle w:val="TableCaption"/>
       </w:pPr>
-      <w:bookmarkStart w:id="71" w:name="_Toc244085983"/>
+      <w:bookmarkStart w:id="71" w:name="_Toc244086120"/>
       <w:r>
         <w:t>B</w:t>
       </w:r>
@@ -42113,7 +42113,7 @@
               <w:rPr>
                 <w:sz w:val="22"/>
               </w:rPr>
-              <w:t>02bd2ea</w:t>
+              <w:t>fd21d10</w:t>
             </w:r>
           </w:p>
         </w:tc>
@@ -42282,7 +42282,7 @@
               <w:rPr>
                 <w:sz w:val="22"/>
               </w:rPr>
-              <w:t>e5e3989</w:t>
+              <w:t>a8076e7</w:t>
             </w:r>
           </w:p>
         </w:tc>
@@ -42451,7 +42451,7 @@
               <w:rPr>
                 <w:sz w:val="22"/>
               </w:rPr>
-              <w:t>110cb57</w:t>
+              <w:t>13a9c30</w:t>
             </w:r>
           </w:p>
         </w:tc>
@@ -42620,7 +42620,7 @@
               <w:rPr>
                 <w:sz w:val="22"/>
               </w:rPr>
-              <w:t>7d2da9d</w:t>
+              <w:t>9b810cd</w:t>
             </w:r>
           </w:p>
         </w:tc>
@@ -42777,7 +42777,7 @@
               <w:rPr>
                 <w:sz w:val="22"/>
               </w:rPr>
-              <w:t>d0be1d7</w:t>
+              <w:t>a8b9108</w:t>
             </w:r>
           </w:p>
         </w:tc>
@@ -42950,7 +42950,7 @@
                 <w:sz w:val="22"/>
               </w:rPr>
               <w:lastRenderedPageBreak/>
-              <w:t>bb05d2a</w:t>
+              <w:t>c5deb47</w:t>
             </w:r>
           </w:p>
         </w:tc>
@@ -43119,7 +43119,7 @@
               <w:rPr>
                 <w:sz w:val="22"/>
               </w:rPr>
-              <w:t>5283a93</w:t>
+              <w:t>f51596d</w:t>
             </w:r>
           </w:p>
         </w:tc>
@@ -43288,7 +43288,7 @@
               <w:rPr>
                 <w:sz w:val="22"/>
               </w:rPr>
-              <w:t>1ea2ddc</w:t>
+              <w:t>6269e17</w:t>
             </w:r>
           </w:p>
         </w:tc>
@@ -43457,7 +43457,7 @@
               <w:rPr>
                 <w:sz w:val="22"/>
               </w:rPr>
-              <w:t>5998888</w:t>
+              <w:t>aedba91</w:t>
             </w:r>
           </w:p>
         </w:tc>
@@ -43626,7 +43626,7 @@
               <w:rPr>
                 <w:sz w:val="22"/>
               </w:rPr>
-              <w:t>d75e46f</w:t>
+              <w:t>5cc5d17</w:t>
             </w:r>
           </w:p>
         </w:tc>
@@ -43773,7 +43773,7 @@
       <w:pPr>
         <w:pStyle w:val="Heading2"/>
       </w:pPr>
-      <w:bookmarkStart w:id="72" w:name="_Toc244085965"/>
+      <w:bookmarkStart w:id="72" w:name="_Toc244086102"/>
       <w:r>
         <w:rPr>
           <w:rFonts w:ascii="Times New Roman" w:hAnsi="Times New Roman"/>
@@ -43846,7 +43846,7 @@
       <w:pPr>
         <w:pStyle w:val="TableCaption"/>
       </w:pPr>
-      <w:bookmarkStart w:id="73" w:name="_Toc244085984"/>
+      <w:bookmarkStart w:id="73" w:name="_Toc244086121"/>
       <w:r>
         <w:t>B</w:t>
       </w:r>
@@ -44874,7 +44874,7 @@
       <w:pPr>
         <w:pStyle w:val="Heading2"/>
       </w:pPr>
-      <w:bookmarkStart w:id="74" w:name="_Toc244085966"/>
+      <w:bookmarkStart w:id="74" w:name="_Toc244086103"/>
       <w:r>
         <w:rPr>
           <w:rFonts w:ascii="Times New Roman" w:hAnsi="Times New Roman"/>
@@ -45087,7 +45087,7 @@
         <w:pStyle w:val="Heading1"/>
         <w:jc w:val="center"/>
       </w:pPr>
-      <w:bookmarkStart w:id="75" w:name="_Toc244085967"/>
+      <w:bookmarkStart w:id="75" w:name="_Toc244086104"/>
       <w:r>
         <w:rPr>
           <w:rFonts w:ascii="Times New Roman" w:hAnsi="Times New Roman"/>
@@ -45143,7 +45143,7 @@
       <w:pPr>
         <w:pStyle w:val="Heading2"/>
       </w:pPr>
-      <w:bookmarkStart w:id="76" w:name="_Toc244085968"/>
+      <w:bookmarkStart w:id="76" w:name="_Toc244086105"/>
       <w:r>
         <w:rPr>
           <w:rFonts w:ascii="Times New Roman" w:hAnsi="Times New Roman"/>
@@ -45631,7 +45631,7 @@
       <w:pPr>
         <w:pStyle w:val="Heading2"/>
       </w:pPr>
-      <w:bookmarkStart w:id="77" w:name="_Toc244085969"/>
+      <w:bookmarkStart w:id="77" w:name="_Toc244086106"/>
       <w:r>
         <w:rPr>
           <w:rFonts w:ascii="Times New Roman" w:hAnsi="Times New Roman"/>
@@ -45844,7 +45844,7 @@
       <w:pPr>
         <w:pStyle w:val="Heading2"/>
       </w:pPr>
-      <w:bookmarkStart w:id="78" w:name="_Toc244085970"/>
+      <w:bookmarkStart w:id="78" w:name="_Toc244086107"/>
       <w:r>
         <w:rPr>
           <w:rFonts w:ascii="Times New Roman" w:hAnsi="Times New Roman"/>
@@ -46277,7 +46277,7 @@
         <w:pStyle w:val="Heading1"/>
         <w:jc w:val="center"/>
       </w:pPr>
-      <w:bookmarkStart w:id="79" w:name="_Toc244085971"/>
+      <w:bookmarkStart w:id="79" w:name="_Toc244086108"/>
       <w:r>
         <w:rPr>
           <w:rFonts w:ascii="Times New Roman" w:hAnsi="Times New Roman"/>
@@ -46485,7 +46485,7 @@
         <w:pStyle w:val="Heading1"/>
         <w:jc w:val="center"/>
       </w:pPr>
-      <w:bookmarkStart w:id="80" w:name="_Toc244085972"/>
+      <w:bookmarkStart w:id="80" w:name="_Toc244086109"/>
       <w:r>
         <w:rPr>
           <w:rFonts w:ascii="Times New Roman" w:hAnsi="Times New Roman"/>
@@ -47225,31 +47225,31 @@
       </w:rPr>
     </w:lvl>
   </w:abstractNum>
-  <w:num w:numId="1" w16cid:durableId="400717939">
+  <w:num w:numId="1" w16cid:durableId="1247768125">
     <w:abstractNumId w:val="8"/>
   </w:num>
-  <w:num w:numId="2" w16cid:durableId="1270162563">
+  <w:num w:numId="2" w16cid:durableId="1051466098">
     <w:abstractNumId w:val="6"/>
   </w:num>
-  <w:num w:numId="3" w16cid:durableId="350880447">
+  <w:num w:numId="3" w16cid:durableId="1555387238">
     <w:abstractNumId w:val="5"/>
   </w:num>
-  <w:num w:numId="4" w16cid:durableId="1098866303">
+  <w:num w:numId="4" w16cid:durableId="263265369">
     <w:abstractNumId w:val="4"/>
   </w:num>
-  <w:num w:numId="5" w16cid:durableId="1334451889">
+  <w:num w:numId="5" w16cid:durableId="375473994">
     <w:abstractNumId w:val="7"/>
   </w:num>
-  <w:num w:numId="6" w16cid:durableId="822234259">
+  <w:num w:numId="6" w16cid:durableId="176432678">
     <w:abstractNumId w:val="3"/>
   </w:num>
-  <w:num w:numId="7" w16cid:durableId="2095279304">
+  <w:num w:numId="7" w16cid:durableId="30423775">
     <w:abstractNumId w:val="2"/>
   </w:num>
-  <w:num w:numId="8" w16cid:durableId="38870731">
+  <w:num w:numId="8" w16cid:durableId="304628816">
     <w:abstractNumId w:val="1"/>
   </w:num>
-  <w:num w:numId="9" w16cid:durableId="1920678251">
+  <w:num w:numId="9" w16cid:durableId="1195927678">
     <w:abstractNumId w:val="0"/>
   </w:num>
 </w:numbering>
@@ -58674,7 +58674,7 @@
     <w:autoRedefine/>
     <w:uiPriority w:val="39"/>
     <w:unhideWhenUsed/>
-    <w:rsid w:val="00D363C7"/>
+    <w:rsid w:val="00FC08FB"/>
     <w:pPr>
       <w:spacing w:after="100"/>
     </w:pPr>
@@ -58686,7 +58686,7 @@
     <w:autoRedefine/>
     <w:uiPriority w:val="39"/>
     <w:unhideWhenUsed/>
-    <w:rsid w:val="00D363C7"/>
+    <w:rsid w:val="00FC08FB"/>
     <w:pPr>
       <w:spacing w:after="100"/>
       <w:ind w:left="260"/>
@@ -58699,7 +58699,7 @@
     <w:autoRedefine/>
     <w:uiPriority w:val="39"/>
     <w:unhideWhenUsed/>
-    <w:rsid w:val="00D363C7"/>
+    <w:rsid w:val="00FC08FB"/>
     <w:pPr>
       <w:spacing w:after="100"/>
       <w:ind w:left="520"/>
@@ -58710,7 +58710,7 @@
     <w:basedOn w:val="DefaultParagraphFont"/>
     <w:uiPriority w:val="99"/>
     <w:unhideWhenUsed/>
-    <w:rsid w:val="00D363C7"/>
+    <w:rsid w:val="00FC08FB"/>
     <w:rPr>
       <w:color w:val="0000FF" w:themeColor="hyperlink"/>
       <w:u w:val="single"/>

</xml_diff>